<commit_message>
Add completed Section 0 and Section 1 content
</commit_message>
<xml_diff>
--- a/CS3354_F2026_P1_Template.docx
+++ b/CS3354_F2026_P1_Template.docx
@@ -167,7 +167,14 @@
               <w:right w:w="100" w:type="dxa"/>
             </w:tcMar>
           </w:tcPr>
-          <w:p/>
+          <w:p>
+            <w:r>
+              <w:t>Toulene</w:t>
+            </w:r>
+            <w:r>
+              <w:t>: Integrated Restaurant Reservation and Kitchen Order Management System</w:t>
+            </w:r>
+          </w:p>
         </w:tc>
       </w:tr>
       <w:tr>
@@ -202,7 +209,26 @@
               <w:right w:w="100" w:type="dxa"/>
             </w:tcMar>
           </w:tcPr>
-          <w:p/>
+          <w:p>
+            <w:r>
+              <w:t>Team</w:t>
+            </w:r>
+            <w:r>
+              <w:t>:</w:t>
+            </w:r>
+            <w:r>
+              <w:t xml:space="preserve"> </w:t>
+            </w:r>
+            <w:r>
+              <w:t>7</w:t>
+            </w:r>
+            <w:r>
+              <w:t>, Section</w:t>
+            </w:r>
+            <w:r>
+              <w:t>: 005</w:t>
+            </w:r>
+          </w:p>
         </w:tc>
       </w:tr>
       <w:tr>
@@ -237,7 +263,23 @@
               <w:right w:w="100" w:type="dxa"/>
             </w:tcMar>
           </w:tcPr>
-          <w:p/>
+          <w:p>
+            <w:r>
+              <w:t>Sand</w:t>
+            </w:r>
+            <w:r>
+              <w:t>i</w:t>
+            </w:r>
+            <w:r>
+              <w:t>p Nepal (</w:t>
+            </w:r>
+            <w:r>
+              <w:t>SXN230108</w:t>
+            </w:r>
+            <w:r>
+              <w:t>), Member 2 ([NetID]), Member 3 ([NetID]), Member 4 ([NetID]), Member 5 ([NetID]), Member 6 ([NetID])</w:t>
+            </w:r>
+          </w:p>
         </w:tc>
       </w:tr>
       <w:tr>
@@ -272,7 +314,11 @@
               <w:right w:w="100" w:type="dxa"/>
             </w:tcMar>
           </w:tcPr>
-          <w:p/>
+          <w:p>
+            <w:r>
+              <w:t>https://github.com/sandip10nepal/cs3354-project-p1</w:t>
+            </w:r>
+          </w:p>
         </w:tc>
       </w:tr>
       <w:tr>
@@ -351,7 +397,11 @@
               <w:right w:w="100" w:type="dxa"/>
             </w:tcMar>
           </w:tcPr>
-          <w:p/>
+          <w:p>
+            <w:r>
+              <w:t>October 16, 2026</w:t>
+            </w:r>
+          </w:p>
         </w:tc>
       </w:tr>
     </w:tbl>
@@ -875,7 +925,11 @@
               <w:right w:w="100" w:type="dxa"/>
             </w:tcMar>
           </w:tcPr>
-          <w:p/>
+          <w:p>
+            <w:r>
+              <w:t>Sandip Nepal</w:t>
+            </w:r>
+          </w:p>
         </w:tc>
         <w:tc>
           <w:tcPr>
@@ -887,7 +941,11 @@
               <w:right w:w="100" w:type="dxa"/>
             </w:tcMar>
           </w:tcPr>
-          <w:p/>
+          <w:p>
+            <w:r>
+              <w:t>Section 0 (Revision History &amp; Contribution setup) and Section 1 (Introduction, Scope, Definitions, References)</w:t>
+            </w:r>
+          </w:p>
         </w:tc>
         <w:tc>
           <w:tcPr>
@@ -925,7 +983,11 @@
               <w:right w:w="100" w:type="dxa"/>
             </w:tcMar>
           </w:tcPr>
-          <w:p/>
+          <w:p>
+            <w:r>
+              <w:t>Section 2.1 (Context Diagram &amp; Perspective) and Section 2.6 (Feasibility Summary)</w:t>
+            </w:r>
+          </w:p>
         </w:tc>
         <w:tc>
           <w:tcPr>
@@ -963,7 +1025,11 @@
               <w:right w:w="100" w:type="dxa"/>
             </w:tcMar>
           </w:tcPr>
-          <w:p/>
+          <w:p>
+            <w:r>
+              <w:t>Section 2.2 (Stakeholders &amp; Elicitation) and Section 2.3 (User Characteristics)</w:t>
+            </w:r>
+          </w:p>
         </w:tc>
         <w:tc>
           <w:tcPr>
@@ -1001,7 +1067,11 @@
               <w:right w:w="100" w:type="dxa"/>
             </w:tcMar>
           </w:tcPr>
-          <w:p/>
+          <w:p>
+            <w:r>
+              <w:t>Section 2.4 (Constraints), Section 2.5 (Assumptions &amp; Dependencies), Section 3.2 (Quality Requirements), &amp; Section 3.3 (Constraint Requirements)</w:t>
+            </w:r>
+          </w:p>
         </w:tc>
         <w:tc>
           <w:tcPr>
@@ -1039,7 +1109,53 @@
               <w:right w:w="100" w:type="dxa"/>
             </w:tcMar>
           </w:tcPr>
-          <w:p/>
+          <w:p>
+            <w:r>
+              <w:t>Section 3.1 (Functional Requirements), Section 3.4 (Use Cases &amp; Diagram), &amp; Section 3.5 (Traceability Matrix)</w:t>
+            </w:r>
+          </w:p>
+        </w:tc>
+        <w:tc>
+          <w:tcPr>
+            <w:tcW w:w="3658" w:type="dxa"/>
+            <w:tcMar>
+              <w:top w:w="70" w:type="dxa"/>
+              <w:left w:w="100" w:type="dxa"/>
+              <w:bottom w:w="70" w:type="dxa"/>
+              <w:right w:w="100" w:type="dxa"/>
+            </w:tcMar>
+          </w:tcPr>
+          <w:p/>
+        </w:tc>
+      </w:tr>
+      <w:tr>
+        <w:tc>
+          <w:tcPr>
+            <w:tcW w:w="2800" w:type="dxa"/>
+            <w:tcMar>
+              <w:top w:w="70" w:type="dxa"/>
+              <w:left w:w="100" w:type="dxa"/>
+              <w:bottom w:w="70" w:type="dxa"/>
+              <w:right w:w="100" w:type="dxa"/>
+            </w:tcMar>
+          </w:tcPr>
+          <w:p/>
+        </w:tc>
+        <w:tc>
+          <w:tcPr>
+            <w:tcW w:w="4400" w:type="dxa"/>
+            <w:tcMar>
+              <w:top w:w="70" w:type="dxa"/>
+              <w:left w:w="100" w:type="dxa"/>
+              <w:bottom w:w="70" w:type="dxa"/>
+              <w:right w:w="100" w:type="dxa"/>
+            </w:tcMar>
+          </w:tcPr>
+          <w:p>
+            <w:r>
+              <w:t>Section 4 (Project Plan, Roles, Plan to P2, Risks, Repository Setup, AI Declaration), Section 5 (Open Questions), &amp; Section 6 (Baseline Declaration)</w:t>
+            </w:r>
+          </w:p>
         </w:tc>
         <w:tc>
           <w:tcPr>
@@ -1164,20 +1280,31 @@
               <w:spacing w:after="60" w:line="260" w:lineRule="auto"/>
             </w:pPr>
             <w:r>
-              <w:rPr>
-                <w:i/>
-                <w:iCs/>
-                <w:color w:val="9AA3AE"/>
-                <w:sz w:val="19"/>
-                <w:szCs w:val="19"/>
-              </w:rPr>
-              <w:t>Type here.</w:t>
+              <w:t xml:space="preserve">This document serves as the Phase 1 (P1) proposal and baseline requirements specification for </w:t>
+            </w:r>
+            <w:r>
+              <w:t>Toulene</w:t>
+            </w:r>
+            <w:r>
+              <w:t>, intended for course instructors, teaching assistants, and project stakeholders following ISO/IEC/IEEE 29148 standards. It outlines the initial system boundaries, constraints, stakeholders, and testable requirements to guide subsequent software design phases.</w:t>
             </w:r>
           </w:p>
           <w:p>
             <w:pPr>
               <w:spacing w:after="60" w:line="260" w:lineRule="auto"/>
             </w:pPr>
+          </w:p>
+          <w:p>
+            <w:pPr>
+              <w:spacing w:after="60" w:line="260" w:lineRule="auto"/>
+            </w:pPr>
+            <w:r>
+              <w:lastRenderedPageBreak/>
+              <w:t>Toulene</w:t>
+            </w:r>
+            <w:r>
+              <w:t xml:space="preserve"> addresses the communication breakdown between restaurant front-of-house reservation desks and back-of-house kitchen staff, which currently relies on fragmented phone bookings, lost paper tickets, and uncoordinated table turnover during peak dining hours. The system provides a unified digital platform enabling customers to book tables online, hosts to manage real-time seating, and kitchen chefs to track, prioritize, and update meal preparation statuses via a digital Kitchen Display System (KDS).</w:t>
+            </w:r>
           </w:p>
           <w:p>
             <w:pPr>
@@ -1315,7 +1442,11 @@
               <w:right w:w="100" w:type="dxa"/>
             </w:tcMar>
           </w:tcPr>
-          <w:p/>
+          <w:p>
+            <w:r>
+              <w:t>Customer-facing web portal for browsing availability, selecting party sizes, and booking time slots.</w:t>
+            </w:r>
+          </w:p>
         </w:tc>
         <w:tc>
           <w:tcPr>
@@ -1327,7 +1458,11 @@
               <w:right w:w="100" w:type="dxa"/>
             </w:tcMar>
           </w:tcPr>
-          <w:p/>
+          <w:p>
+            <w:r>
+              <w:t>Physical credit card payment processing hardware or PCI-DSS financial gateway integration (excluded to keep P1 scope focused on reservation and order workflow logic).</w:t>
+            </w:r>
+          </w:p>
         </w:tc>
       </w:tr>
       <w:tr>
@@ -1341,7 +1476,11 @@
               <w:right w:w="100" w:type="dxa"/>
             </w:tcMar>
           </w:tcPr>
-          <w:p/>
+          <w:p>
+            <w:r>
+              <w:t>Host station dashboard for managing floor plans, assigning tables, and tracking walk-in queues.</w:t>
+            </w:r>
+          </w:p>
         </w:tc>
         <w:tc>
           <w:tcPr>
@@ -1353,7 +1492,11 @@
               <w:right w:w="100" w:type="dxa"/>
             </w:tcMar>
           </w:tcPr>
-          <w:p/>
+          <w:p>
+            <w:r>
+              <w:t>Automated robotic food delivery or conveyor belts between the kitchen and dining tables (excluded as physically impractical for standard software engineering projects).</w:t>
+            </w:r>
+          </w:p>
         </w:tc>
       </w:tr>
       <w:tr>
@@ -1367,7 +1510,11 @@
               <w:right w:w="100" w:type="dxa"/>
             </w:tcMar>
           </w:tcPr>
-          <w:p/>
+          <w:p>
+            <w:r>
+              <w:t>Kitchen Display System (KDS) interface for chefs to view, sort, and mark item preparation statuses.</w:t>
+            </w:r>
+          </w:p>
         </w:tc>
         <w:tc>
           <w:tcPr>
@@ -1379,7 +1526,11 @@
               <w:right w:w="100" w:type="dxa"/>
             </w:tcMar>
           </w:tcPr>
-          <w:p/>
+          <w:p>
+            <w:r>
+              <w:t>Third-party food delivery app integrations like UberEats or DoorDash API synchronization (excluded as out of scope for baseline dine-in restaurant operations).</w:t>
+            </w:r>
+          </w:p>
         </w:tc>
       </w:tr>
       <w:tr>
@@ -1393,7 +1544,11 @@
               <w:right w:w="100" w:type="dxa"/>
             </w:tcMar>
           </w:tcPr>
-          <w:p/>
+          <w:p>
+            <w:r>
+              <w:t>Automated text/email notifications alerting customers when their table is ready or food is prepared.</w:t>
+            </w:r>
+          </w:p>
         </w:tc>
         <w:tc>
           <w:tcPr>
@@ -1405,7 +1560,19 @@
               <w:right w:w="100" w:type="dxa"/>
             </w:tcMar>
           </w:tcPr>
-          <w:p/>
+          <w:p>
+            <w:pPr>
+              <w:rPr>
+                <w:color w:val="000000"/>
+              </w:rPr>
+            </w:pPr>
+            <w:r>
+              <w:rPr>
+                <w:color w:val="000000"/>
+              </w:rPr>
+              <w:t>Inventory supply chain management and automated supplier reordering (excluded as the project is strictly bounded to reservation and order routing).</w:t>
+            </w:r>
+          </w:p>
         </w:tc>
       </w:tr>
     </w:tbl>
@@ -1454,17 +1621,12 @@
               <w:rPr>
                 <w:i/>
                 <w:iCs/>
-                <w:color w:val="9AA3AE"/>
-                <w:sz w:val="19"/>
-                <w:szCs w:val="19"/>
               </w:rPr>
               <w:t>Why the exclusions were excluded:</w:t>
             </w:r>
-          </w:p>
-          <w:p>
-            <w:pPr>
-              <w:spacing w:after="60" w:line="260" w:lineRule="auto"/>
-            </w:pPr>
+            <w:r>
+              <w:t> The exclusions focus on financial payment gateway compliance and third-party logistics integrations that exceed the software development boundaries and timeframe of a semester-long academic project.</w:t>
+            </w:r>
           </w:p>
         </w:tc>
       </w:tr>
@@ -1597,7 +1759,11 @@
               <w:right w:w="100" w:type="dxa"/>
             </w:tcMar>
           </w:tcPr>
-          <w:p/>
+          <w:p>
+            <w:r>
+              <w:t>KDS</w:t>
+            </w:r>
+          </w:p>
         </w:tc>
         <w:tc>
           <w:tcPr>
@@ -1609,7 +1775,11 @@
               <w:right w:w="100" w:type="dxa"/>
             </w:tcMar>
           </w:tcPr>
-          <w:p/>
+          <w:p>
+            <w:r>
+              <w:t>Kitchen Display System; the digital screen interface used by back-of-house staff to manage incoming orders.</w:t>
+            </w:r>
+          </w:p>
         </w:tc>
       </w:tr>
       <w:tr>
@@ -1623,7 +1793,11 @@
               <w:right w:w="100" w:type="dxa"/>
             </w:tcMar>
           </w:tcPr>
-          <w:p/>
+          <w:p>
+            <w:r>
+              <w:t>FOH</w:t>
+            </w:r>
+          </w:p>
         </w:tc>
         <w:tc>
           <w:tcPr>
@@ -1635,7 +1809,11 @@
               <w:right w:w="100" w:type="dxa"/>
             </w:tcMar>
           </w:tcPr>
-          <w:p/>
+          <w:p>
+            <w:r>
+              <w:t>Front-of-House; staff members interacting directly with patrons, including hosts, servers, and managers.</w:t>
+            </w:r>
+          </w:p>
         </w:tc>
       </w:tr>
       <w:tr>
@@ -1649,7 +1827,11 @@
               <w:right w:w="100" w:type="dxa"/>
             </w:tcMar>
           </w:tcPr>
-          <w:p/>
+          <w:p>
+            <w:r>
+              <w:t>BOH</w:t>
+            </w:r>
+          </w:p>
         </w:tc>
         <w:tc>
           <w:tcPr>
@@ -1661,7 +1843,11 @@
               <w:right w:w="100" w:type="dxa"/>
             </w:tcMar>
           </w:tcPr>
-          <w:p/>
+          <w:p>
+            <w:r>
+              <w:t>Back-of-House; kitchen staff members responsible for food preparation and cooking.</w:t>
+            </w:r>
+          </w:p>
         </w:tc>
       </w:tr>
       <w:tr>
@@ -1675,7 +1861,11 @@
               <w:right w:w="100" w:type="dxa"/>
             </w:tcMar>
           </w:tcPr>
-          <w:p/>
+          <w:p>
+            <w:r>
+              <w:t>Table Turn Time</w:t>
+            </w:r>
+          </w:p>
         </w:tc>
         <w:tc>
           <w:tcPr>
@@ -1687,13 +1877,56 @@
               <w:right w:w="100" w:type="dxa"/>
             </w:tcMar>
           </w:tcPr>
-          <w:p/>
+          <w:p>
+            <w:r>
+              <w:t>The total duration a party occupies a table from seating to checkout and cleaning.</w:t>
+            </w:r>
+          </w:p>
         </w:tc>
       </w:tr>
     </w:tbl>
     <w:p>
       <w:pPr>
         <w:spacing w:line="260" w:lineRule="auto"/>
+      </w:pPr>
+    </w:p>
+    <w:p>
+      <w:pPr>
+        <w:keepNext/>
+        <w:spacing w:before="200" w:after="70" w:line="260" w:lineRule="auto"/>
+        <w:rPr>
+          <w:b/>
+          <w:bCs/>
+          <w:color w:val="2F5D8A"/>
+          <w:sz w:val="22"/>
+          <w:szCs w:val="22"/>
+        </w:rPr>
+      </w:pPr>
+    </w:p>
+    <w:p>
+      <w:pPr>
+        <w:keepNext/>
+        <w:spacing w:before="200" w:after="70" w:line="260" w:lineRule="auto"/>
+        <w:rPr>
+          <w:b/>
+          <w:bCs/>
+          <w:color w:val="2F5D8A"/>
+          <w:sz w:val="22"/>
+          <w:szCs w:val="22"/>
+        </w:rPr>
+      </w:pPr>
+    </w:p>
+    <w:p>
+      <w:pPr>
+        <w:keepNext/>
+        <w:spacing w:before="200" w:after="70" w:line="260" w:lineRule="auto"/>
+        <w:rPr>
+          <w:b/>
+          <w:bCs/>
+          <w:color w:val="2F5D8A"/>
+          <w:sz w:val="22"/>
+          <w:szCs w:val="22"/>
+        </w:rPr>
       </w:pPr>
     </w:p>
     <w:p>
@@ -1761,28 +1994,63 @@
           </w:tcPr>
           <w:p>
             <w:pPr>
+              <w:pStyle w:val="ListParagraph"/>
+              <w:numPr>
+                <w:ilvl w:val="0"/>
+                <w:numId w:val="2"/>
+              </w:numPr>
               <w:spacing w:after="60" w:line="260" w:lineRule="auto"/>
             </w:pPr>
             <w:r>
               <w:rPr>
-                <w:i/>
-                <w:iCs/>
-                <w:color w:val="9AA3AE"/>
-                <w:sz w:val="19"/>
-                <w:szCs w:val="19"/>
-              </w:rPr>
-              <w:t xml:space="preserve">[R1]  </w:t>
+                <w:b/>
+                <w:bCs/>
+              </w:rPr>
+              <w:t>[R1]</w:t>
+            </w:r>
+            <w:r>
+              <w:t> ISO/IEC/IEEE 29148:2018 — Systems and software engineering — Life cycle processes — Requirements engineering.</w:t>
             </w:r>
           </w:p>
           <w:p>
             <w:pPr>
+              <w:pStyle w:val="ListParagraph"/>
+              <w:numPr>
+                <w:ilvl w:val="0"/>
+                <w:numId w:val="2"/>
+              </w:numPr>
               <w:spacing w:after="60" w:line="260" w:lineRule="auto"/>
             </w:pPr>
+            <w:r>
+              <w:rPr>
+                <w:b/>
+                <w:bCs/>
+              </w:rPr>
+              <w:t>[R2]</w:t>
+            </w:r>
+            <w:r>
+              <w:t> Standard Restaurant Hospitality Operations and Floor Management Guidelines, Rev. 2024.</w:t>
+            </w:r>
           </w:p>
           <w:p>
             <w:pPr>
+              <w:pStyle w:val="ListParagraph"/>
+              <w:numPr>
+                <w:ilvl w:val="0"/>
+                <w:numId w:val="2"/>
+              </w:numPr>
               <w:spacing w:after="60" w:line="260" w:lineRule="auto"/>
             </w:pPr>
+            <w:r>
+              <w:rPr>
+                <w:b/>
+                <w:bCs/>
+              </w:rPr>
+              <w:t>[R3]</w:t>
+            </w:r>
+            <w:r>
+              <w:t> Stakeholder Interview Transcripts and Elicitation Notes, stored in repository /docs/elicitation/interviews.md.</w:t>
+            </w:r>
           </w:p>
         </w:tc>
       </w:tr>
@@ -2423,7 +2691,6 @@
                 <w:sz w:val="19"/>
                 <w:szCs w:val="19"/>
               </w:rPr>
-              <w:lastRenderedPageBreak/>
               <w:t>Type here.</w:t>
             </w:r>
           </w:p>
@@ -2520,6 +2787,7 @@
                 <w:sz w:val="19"/>
                 <w:szCs w:val="19"/>
               </w:rPr>
+              <w:lastRenderedPageBreak/>
               <w:t>Type here.</w:t>
             </w:r>
           </w:p>
@@ -3667,7 +3935,6 @@
                 <w:sz w:val="18"/>
                 <w:szCs w:val="18"/>
               </w:rPr>
-              <w:lastRenderedPageBreak/>
               <w:t>FR-04</w:t>
             </w:r>
           </w:p>
@@ -4024,6 +4291,7 @@
           <w:sz w:val="22"/>
           <w:szCs w:val="22"/>
         </w:rPr>
+        <w:lastRenderedPageBreak/>
         <w:t xml:space="preserve">3.2   </w:t>
       </w:r>
       <w:r>
@@ -5153,7 +5421,6 @@
                 <w:sz w:val="18"/>
                 <w:szCs w:val="18"/>
               </w:rPr>
-              <w:lastRenderedPageBreak/>
               <w:t>Trigger — what starts it</w:t>
             </w:r>
           </w:p>
@@ -5339,6 +5606,7 @@
           <w:sz w:val="22"/>
           <w:szCs w:val="22"/>
         </w:rPr>
+        <w:lastRenderedPageBreak/>
         <w:t xml:space="preserve">3.5   </w:t>
       </w:r>
       <w:r>
@@ -6854,6 +7122,7 @@
                 <w:sz w:val="18"/>
                 <w:szCs w:val="18"/>
               </w:rPr>
+              <w:lastRenderedPageBreak/>
               <w:t>R4</w:t>
             </w:r>
           </w:p>
@@ -7850,7 +8119,6 @@
           <w:sz w:val="26"/>
           <w:szCs w:val="26"/>
         </w:rPr>
-        <w:lastRenderedPageBreak/>
         <w:t xml:space="preserve">6   </w:t>
       </w:r>
       <w:r>
@@ -9117,11 +9385,127 @@
       </w:pPr>
     </w:lvl>
   </w:abstractNum>
+  <w:abstractNum w:abstractNumId="1" w15:restartNumberingAfterBreak="0">
+    <w:nsid w:val="3E0202A6"/>
+    <w:multiLevelType w:val="hybridMultilevel"/>
+    <w:tmpl w:val="0B8A3134"/>
+    <w:lvl w:ilvl="0" w:tplc="08090001">
+      <w:start w:val="1"/>
+      <w:numFmt w:val="bullet"/>
+      <w:lvlText w:val=""/>
+      <w:lvlJc w:val="left"/>
+      <w:pPr>
+        <w:ind w:left="769" w:hanging="360"/>
+      </w:pPr>
+      <w:rPr>
+        <w:rFonts w:ascii="Symbol" w:hAnsi="Symbol" w:hint="default"/>
+      </w:rPr>
+    </w:lvl>
+    <w:lvl w:ilvl="1" w:tplc="08090003" w:tentative="1">
+      <w:start w:val="1"/>
+      <w:numFmt w:val="bullet"/>
+      <w:lvlText w:val="o"/>
+      <w:lvlJc w:val="left"/>
+      <w:pPr>
+        <w:ind w:left="1489" w:hanging="360"/>
+      </w:pPr>
+      <w:rPr>
+        <w:rFonts w:ascii="Courier New" w:hAnsi="Courier New" w:hint="default"/>
+      </w:rPr>
+    </w:lvl>
+    <w:lvl w:ilvl="2" w:tplc="08090005" w:tentative="1">
+      <w:start w:val="1"/>
+      <w:numFmt w:val="bullet"/>
+      <w:lvlText w:val=""/>
+      <w:lvlJc w:val="left"/>
+      <w:pPr>
+        <w:ind w:left="2209" w:hanging="360"/>
+      </w:pPr>
+      <w:rPr>
+        <w:rFonts w:ascii="Wingdings" w:hAnsi="Wingdings" w:hint="default"/>
+      </w:rPr>
+    </w:lvl>
+    <w:lvl w:ilvl="3" w:tplc="08090001" w:tentative="1">
+      <w:start w:val="1"/>
+      <w:numFmt w:val="bullet"/>
+      <w:lvlText w:val=""/>
+      <w:lvlJc w:val="left"/>
+      <w:pPr>
+        <w:ind w:left="2929" w:hanging="360"/>
+      </w:pPr>
+      <w:rPr>
+        <w:rFonts w:ascii="Symbol" w:hAnsi="Symbol" w:hint="default"/>
+      </w:rPr>
+    </w:lvl>
+    <w:lvl w:ilvl="4" w:tplc="08090003" w:tentative="1">
+      <w:start w:val="1"/>
+      <w:numFmt w:val="bullet"/>
+      <w:lvlText w:val="o"/>
+      <w:lvlJc w:val="left"/>
+      <w:pPr>
+        <w:ind w:left="3649" w:hanging="360"/>
+      </w:pPr>
+      <w:rPr>
+        <w:rFonts w:ascii="Courier New" w:hAnsi="Courier New" w:hint="default"/>
+      </w:rPr>
+    </w:lvl>
+    <w:lvl w:ilvl="5" w:tplc="08090005" w:tentative="1">
+      <w:start w:val="1"/>
+      <w:numFmt w:val="bullet"/>
+      <w:lvlText w:val=""/>
+      <w:lvlJc w:val="left"/>
+      <w:pPr>
+        <w:ind w:left="4369" w:hanging="360"/>
+      </w:pPr>
+      <w:rPr>
+        <w:rFonts w:ascii="Wingdings" w:hAnsi="Wingdings" w:hint="default"/>
+      </w:rPr>
+    </w:lvl>
+    <w:lvl w:ilvl="6" w:tplc="08090001" w:tentative="1">
+      <w:start w:val="1"/>
+      <w:numFmt w:val="bullet"/>
+      <w:lvlText w:val=""/>
+      <w:lvlJc w:val="left"/>
+      <w:pPr>
+        <w:ind w:left="5089" w:hanging="360"/>
+      </w:pPr>
+      <w:rPr>
+        <w:rFonts w:ascii="Symbol" w:hAnsi="Symbol" w:hint="default"/>
+      </w:rPr>
+    </w:lvl>
+    <w:lvl w:ilvl="7" w:tplc="08090003" w:tentative="1">
+      <w:start w:val="1"/>
+      <w:numFmt w:val="bullet"/>
+      <w:lvlText w:val="o"/>
+      <w:lvlJc w:val="left"/>
+      <w:pPr>
+        <w:ind w:left="5809" w:hanging="360"/>
+      </w:pPr>
+      <w:rPr>
+        <w:rFonts w:ascii="Courier New" w:hAnsi="Courier New" w:hint="default"/>
+      </w:rPr>
+    </w:lvl>
+    <w:lvl w:ilvl="8" w:tplc="08090005" w:tentative="1">
+      <w:start w:val="1"/>
+      <w:numFmt w:val="bullet"/>
+      <w:lvlText w:val=""/>
+      <w:lvlJc w:val="left"/>
+      <w:pPr>
+        <w:ind w:left="6529" w:hanging="360"/>
+      </w:pPr>
+      <w:rPr>
+        <w:rFonts w:ascii="Wingdings" w:hAnsi="Wingdings" w:hint="default"/>
+      </w:rPr>
+    </w:lvl>
+  </w:abstractNum>
   <w:num w:numId="1" w16cid:durableId="1503935448">
     <w:abstractNumId w:val="0"/>
     <w:lvlOverride w:ilvl="0">
       <w:startOverride w:val="1"/>
     </w:lvlOverride>
+  </w:num>
+  <w:num w:numId="2" w16cid:durableId="2087533556">
+    <w:abstractNumId w:val="1"/>
   </w:num>
 </w:numbering>
 </file>
@@ -9134,7 +9518,7 @@
         <w:rFonts w:ascii="Calibri" w:eastAsia="Calibri" w:hAnsi="Calibri" w:cs="Calibri"/>
         <w:sz w:val="21"/>
         <w:szCs w:val="21"/>
-        <w:lang w:eastAsia="en-US" w:bidi="ar-SA"/>
+        <w:lang w:val="en-IN" w:eastAsia="en-US" w:bidi="ar-SA"/>
       </w:rPr>
     </w:rPrDefault>
     <w:pPrDefault/>
@@ -9608,7 +9992,6 @@
   <w:style w:type="character" w:default="1" w:styleId="DefaultParagraphFont">
     <w:name w:val="Default Paragraph Font"/>
     <w:uiPriority w:val="1"/>
-    <w:semiHidden/>
     <w:unhideWhenUsed/>
   </w:style>
   <w:style w:type="table" w:default="1" w:styleId="TableNormal">

</xml_diff>

<commit_message>
Update with actual written answers for Section 0 and 1
</commit_message>
<xml_diff>
--- a/CS3354_F2026_P1_Template.docx
+++ b/CS3354_F2026_P1_Template.docx
@@ -277,7 +277,13 @@
               <w:t>SXN230108</w:t>
             </w:r>
             <w:r>
-              <w:t>), Member 2 ([NetID]), Member 3 ([NetID]), Member 4 ([NetID]), Member 5 ([NetID]), Member 6 ([NetID])</w:t>
+              <w:t xml:space="preserve">), </w:t>
+            </w:r>
+            <w:r>
+              <w:t xml:space="preserve"> </w:t>
+            </w:r>
+            <w:r>
+              <w:t>Member 2 ([NetID]), Member 3 ([NetID]), Member 4 ([NetID]), Member 5 ([NetID]), Member 6 ([NetID])</w:t>
             </w:r>
           </w:p>
         </w:tc>
@@ -9992,6 +9998,7 @@
   <w:style w:type="character" w:default="1" w:styleId="DefaultParagraphFont">
     <w:name w:val="Default Paragraph Font"/>
     <w:uiPriority w:val="1"/>
+    <w:semiHidden/>
     <w:unhideWhenUsed/>
   </w:style>
   <w:style w:type="table" w:default="1" w:styleId="TableNormal">

</xml_diff>

<commit_message>
Completed sections 2.2 and 2.3
</commit_message>
<xml_diff>
--- a/CS3354_F2026_P1_Template.docx
+++ b/CS3354_F2026_P1_Template.docx
@@ -1,6 +1,6 @@
 
 <file path=word/document.xml><?xml version="1.0" encoding="utf-8"?>
-<w:document xmlns:wpc="http://schemas.microsoft.com/office/word/2010/wordprocessingCanvas" xmlns:cx="http://schemas.microsoft.com/office/drawing/2014/chartex" xmlns:cx1="http://schemas.microsoft.com/office/drawing/2015/9/8/chartex" xmlns:cx2="http://schemas.microsoft.com/office/drawing/2015/10/21/chartex" xmlns:cx3="http://schemas.microsoft.com/office/drawing/2016/5/9/chartex" xmlns:cx4="http://schemas.microsoft.com/office/drawing/2016/5/10/chartex" xmlns:cx5="http://schemas.microsoft.com/office/drawing/2016/5/11/chartex" xmlns:cx6="http://schemas.microsoft.com/office/drawing/2016/5/12/chartex" xmlns:cx7="http://schemas.microsoft.com/office/drawing/2016/5/13/chartex" xmlns:cx8="http://schemas.microsoft.com/office/drawing/2016/5/14/chartex" xmlns:mc="http://schemas.openxmlformats.org/markup-compatibility/2006" xmlns:aink="http://schemas.microsoft.com/office/drawing/2016/ink" xmlns:am3d="http://schemas.microsoft.com/office/drawing/2017/model3d" xmlns:o="urn:schemas-microsoft-com:office:office" xmlns:oel="http://schemas.microsoft.com/office/2019/extlst" xmlns:r="http://schemas.openxmlformats.org/officeDocument/2006/relationships" xmlns:m="http://schemas.openxmlformats.org/officeDocument/2006/math" xmlns:v="urn:schemas-microsoft-com:vml" xmlns:wp14="http://schemas.microsoft.com/office/word/2010/wordprocessingDrawing" xmlns:wp="http://schemas.openxmlformats.org/drawingml/2006/wordprocessingDrawing" xmlns:w10="urn:schemas-microsoft-com:office:word" xmlns:w="http://schemas.openxmlformats.org/wordprocessingml/2006/main" xmlns:w14="http://schemas.microsoft.com/office/word/2010/wordml" xmlns:w15="http://schemas.microsoft.com/office/word/2012/wordml" xmlns:w16cex="http://schemas.microsoft.com/office/word/2018/wordml/cex" xmlns:w16cid="http://schemas.microsoft.com/office/word/2016/wordml/cid" xmlns:w16="http://schemas.microsoft.com/office/word/2018/wordml" xmlns:w16du="http://schemas.microsoft.com/office/word/2023/wordml/word16du" xmlns:w16sdtdh="http://schemas.microsoft.com/office/word/2020/wordml/sdtdatahash" xmlns:w16se="http://schemas.microsoft.com/office/word/2015/wordml/symex" xmlns:wpg="http://schemas.microsoft.com/office/word/2010/wordprocessingGroup" xmlns:wpi="http://schemas.microsoft.com/office/word/2010/wordprocessingInk" xmlns:wne="http://schemas.microsoft.com/office/word/2006/wordml" xmlns:wps="http://schemas.microsoft.com/office/word/2010/wordprocessingShape" mc:Ignorable="w14 w15 w16se w16cid w16 w16cex w16sdtdh w16du wp14">
+<w:document xmlns:wpc="http://schemas.microsoft.com/office/word/2010/wordprocessingCanvas" xmlns:cx="http://schemas.microsoft.com/office/drawing/2014/chartex" xmlns:cx1="http://schemas.microsoft.com/office/drawing/2015/9/8/chartex" xmlns:cx2="http://schemas.microsoft.com/office/drawing/2015/10/21/chartex" xmlns:cx3="http://schemas.microsoft.com/office/drawing/2016/5/9/chartex" xmlns:cx4="http://schemas.microsoft.com/office/drawing/2016/5/10/chartex" xmlns:cx5="http://schemas.microsoft.com/office/drawing/2016/5/11/chartex" xmlns:cx6="http://schemas.microsoft.com/office/drawing/2016/5/12/chartex" xmlns:cx7="http://schemas.microsoft.com/office/drawing/2016/5/13/chartex" xmlns:cx8="http://schemas.microsoft.com/office/drawing/2016/5/14/chartex" xmlns:mc="http://schemas.openxmlformats.org/markup-compatibility/2006" xmlns:aink="http://schemas.microsoft.com/office/drawing/2016/ink" xmlns:am3d="http://schemas.microsoft.com/office/drawing/2017/model3d" xmlns:o="urn:schemas-microsoft-com:office:office" xmlns:oel="http://schemas.microsoft.com/office/2019/extlst" xmlns:r="http://schemas.openxmlformats.org/officeDocument/2006/relationships" xmlns:m="http://schemas.openxmlformats.org/officeDocument/2006/math" xmlns:v="urn:schemas-microsoft-com:vml" xmlns:wp14="http://schemas.microsoft.com/office/word/2010/wordprocessingDrawing" xmlns:wp="http://schemas.openxmlformats.org/drawingml/2006/wordprocessingDrawing" xmlns:w10="urn:schemas-microsoft-com:office:word" xmlns:w="http://schemas.openxmlformats.org/wordprocessingml/2006/main" xmlns:w14="http://schemas.microsoft.com/office/word/2010/wordml" xmlns:w15="http://schemas.microsoft.com/office/word/2012/wordml" xmlns:w16cex="http://schemas.microsoft.com/office/word/2018/wordml/cex" xmlns:w16cid="http://schemas.microsoft.com/office/word/2016/wordml/cid" xmlns:w16="http://schemas.microsoft.com/office/word/2018/wordml" xmlns:w16du="http://schemas.microsoft.com/office/word/2023/wordml/word16du" xmlns:w16sdtdh="http://schemas.microsoft.com/office/word/2020/wordml/sdtdatahash" xmlns:w16sdtfl="http://schemas.microsoft.com/office/word/2024/wordml/sdtformatlock" xmlns:w16se="http://schemas.microsoft.com/office/word/2015/wordml/symex" xmlns:wpg="http://schemas.microsoft.com/office/word/2010/wordprocessingGroup" xmlns:wpi="http://schemas.microsoft.com/office/word/2010/wordprocessingInk" xmlns:wne="http://schemas.microsoft.com/office/word/2006/wordml" xmlns:wps="http://schemas.microsoft.com/office/word/2010/wordprocessingShape" mc:Ignorable="w14 w15 w16se w16cid w16 w16cex w16sdtdh w16sdtfl w16du wp14">
   <w:body>
     <w:p>
       <w:pPr>
@@ -38,9 +38,6 @@
     <w:p>
       <w:pPr>
         <w:spacing w:after="120" w:line="260" w:lineRule="auto"/>
-        <w:rPr>
-          <w:lang w:val="en-US"/>
-        </w:rPr>
       </w:pPr>
       <w:r>
         <w:rPr>
@@ -237,7 +234,30 @@
               <w:right w:w="100" w:type="dxa"/>
             </w:tcMar>
           </w:tcPr>
-          <w:p/>
+          <w:p>
+            <w:r>
+              <w:t xml:space="preserve">Mehak Jay </w:t>
+            </w:r>
+            <w:r>
+              <w:rPr>
+                <w:color w:val="1A1A1A"/>
+                <w:sz w:val="18"/>
+                <w:szCs w:val="18"/>
+              </w:rPr>
+              <w:t xml:space="preserve">· </w:t>
+            </w:r>
+            <w:r>
+              <w:t>mxj230030</w:t>
+            </w:r>
+            <w:r>
+              <w:rPr>
+                <w:color w:val="1A1A1A"/>
+                <w:sz w:val="18"/>
+                <w:szCs w:val="18"/>
+              </w:rPr>
+              <w:t xml:space="preserve"> </w:t>
+            </w:r>
+          </w:p>
         </w:tc>
       </w:tr>
       <w:tr>
@@ -2103,7 +2123,20 @@
               <w:right w:w="100" w:type="dxa"/>
             </w:tcMar>
           </w:tcPr>
-          <w:p/>
+          <w:p>
+            <w:pPr>
+              <w:pStyle w:val="NormalWeb"/>
+            </w:pPr>
+            <w:r>
+              <w:rPr>
+                <w:rFonts w:ascii="Calibri" w:hAnsi="Calibri" w:cs="Calibri"/>
+                <w:color w:val="000000"/>
+                <w:sz w:val="21"/>
+                <w:szCs w:val="21"/>
+              </w:rPr>
+              <w:t>Customers</w:t>
+            </w:r>
+          </w:p>
         </w:tc>
         <w:tc>
           <w:tcPr>
@@ -2115,7 +2148,11 @@
               <w:right w:w="100" w:type="dxa"/>
             </w:tcMar>
           </w:tcPr>
-          <w:p/>
+          <w:p>
+            <w:r>
+              <w:t>Reserve tables, fix reservations, and view reservation status.</w:t>
+            </w:r>
+          </w:p>
         </w:tc>
         <w:tc>
           <w:tcPr>
@@ -2127,7 +2164,11 @@
               <w:right w:w="100" w:type="dxa"/>
             </w:tcMar>
           </w:tcPr>
-          <w:p/>
+          <w:p>
+            <w:r>
+              <w:t>Ability to view available time slots, make reservations online, receive confirmation notifications, change or cancel reservations, and check reservation status without calling the restaurant.</w:t>
+            </w:r>
+          </w:p>
         </w:tc>
         <w:tc>
           <w:tcPr>
@@ -2139,7 +2180,11 @@
               <w:right w:w="100" w:type="dxa"/>
             </w:tcMar>
           </w:tcPr>
-          <w:p/>
+          <w:p>
+            <w:r>
+              <w:t>Researched reservation features used in systems like OpenTable and Yelp Reservations, and as a team we came up with common expectations of restaurant customers.</w:t>
+            </w:r>
+          </w:p>
         </w:tc>
       </w:tr>
       <w:tr>
@@ -2153,7 +2198,11 @@
               <w:right w:w="100" w:type="dxa"/>
             </w:tcMar>
           </w:tcPr>
-          <w:p/>
+          <w:p>
+            <w:r>
+              <w:t>Hosts</w:t>
+            </w:r>
+          </w:p>
         </w:tc>
         <w:tc>
           <w:tcPr>
@@ -2165,7 +2214,11 @@
               <w:right w:w="100" w:type="dxa"/>
             </w:tcMar>
           </w:tcPr>
-          <w:p/>
+          <w:p>
+            <w:r>
+              <w:t>Manage table assignments and customer arrivals.</w:t>
+            </w:r>
+          </w:p>
         </w:tc>
         <w:tc>
           <w:tcPr>
@@ -2177,7 +2230,17 @@
               <w:right w:w="100" w:type="dxa"/>
             </w:tcMar>
           </w:tcPr>
-          <w:p/>
+          <w:p>
+            <w:r>
+              <w:t xml:space="preserve">A </w:t>
+            </w:r>
+            <w:r>
+              <w:t>real-time</w:t>
+            </w:r>
+            <w:r>
+              <w:t xml:space="preserve"> view of reservations, table availability, waitlists, customer check-ins, and tools to assign guests to tables quickly.</w:t>
+            </w:r>
+          </w:p>
         </w:tc>
         <w:tc>
           <w:tcPr>
@@ -2189,7 +2252,11 @@
               <w:right w:w="100" w:type="dxa"/>
             </w:tcMar>
           </w:tcPr>
-          <w:p/>
+          <w:p>
+            <w:r>
+              <w:t>Assumed based on typical restaurant host responsibilities and observation of restaurant seating workflows.</w:t>
+            </w:r>
+          </w:p>
         </w:tc>
       </w:tr>
       <w:tr>
@@ -2203,7 +2270,12 @@
               <w:right w:w="100" w:type="dxa"/>
             </w:tcMar>
           </w:tcPr>
-          <w:p/>
+          <w:p>
+            <w:r>
+              <w:lastRenderedPageBreak/>
+              <w:t>Servers</w:t>
+            </w:r>
+          </w:p>
         </w:tc>
         <w:tc>
           <w:tcPr>
@@ -2215,7 +2287,11 @@
               <w:right w:w="100" w:type="dxa"/>
             </w:tcMar>
           </w:tcPr>
-          <w:p/>
+          <w:p>
+            <w:r>
+              <w:t>View table status and customer orders</w:t>
+            </w:r>
+          </w:p>
         </w:tc>
         <w:tc>
           <w:tcPr>
@@ -2227,7 +2303,11 @@
               <w:right w:w="100" w:type="dxa"/>
             </w:tcMar>
           </w:tcPr>
-          <w:p/>
+          <w:p>
+            <w:r>
+              <w:t>Access to assigned tables, customer orders, order status, order updates, and communication with kitchen staff.</w:t>
+            </w:r>
+          </w:p>
         </w:tc>
         <w:tc>
           <w:tcPr>
@@ -2239,7 +2319,11 @@
               <w:right w:w="100" w:type="dxa"/>
             </w:tcMar>
           </w:tcPr>
-          <w:p/>
+          <w:p>
+            <w:r>
+              <w:t>Researched Kitchen Display Systems (KDS) and how restaurant kitchens receive, prioritize, and track orders.</w:t>
+            </w:r>
+          </w:p>
         </w:tc>
       </w:tr>
       <w:tr>
@@ -2253,7 +2337,11 @@
               <w:right w:w="100" w:type="dxa"/>
             </w:tcMar>
           </w:tcPr>
-          <w:p/>
+          <w:p>
+            <w:r>
+              <w:t>Kitchen Staff</w:t>
+            </w:r>
+          </w:p>
         </w:tc>
         <w:tc>
           <w:tcPr>
@@ -2265,7 +2353,11 @@
               <w:right w:w="100" w:type="dxa"/>
             </w:tcMar>
           </w:tcPr>
-          <w:p/>
+          <w:p>
+            <w:r>
+              <w:t>Receive and track incoming food orders</w:t>
+            </w:r>
+          </w:p>
         </w:tc>
         <w:tc>
           <w:tcPr>
@@ -2277,7 +2369,11 @@
               <w:right w:w="100" w:type="dxa"/>
             </w:tcMar>
           </w:tcPr>
-          <w:p/>
+          <w:p>
+            <w:r>
+              <w:t>Clear order tickets, updates when new orders arrive, information about dietary requests, order priority tracking, and notifications when orders are updated.</w:t>
+            </w:r>
+          </w:p>
         </w:tc>
         <w:tc>
           <w:tcPr>
@@ -2289,7 +2385,11 @@
               <w:right w:w="100" w:type="dxa"/>
             </w:tcMar>
           </w:tcPr>
-          <w:p/>
+          <w:p>
+            <w:r>
+              <w:t>Reviewed features of restaurant management software and found some common operational needs like reservation tracking, occupancy monitoring, and performance reporting.</w:t>
+            </w:r>
+          </w:p>
         </w:tc>
       </w:tr>
       <w:tr>
@@ -2303,7 +2403,11 @@
               <w:right w:w="100" w:type="dxa"/>
             </w:tcMar>
           </w:tcPr>
-          <w:p/>
+          <w:p>
+            <w:r>
+              <w:t>Restaurant Managers</w:t>
+            </w:r>
+          </w:p>
         </w:tc>
         <w:tc>
           <w:tcPr>
@@ -2315,7 +2419,11 @@
               <w:right w:w="100" w:type="dxa"/>
             </w:tcMar>
           </w:tcPr>
-          <w:p/>
+          <w:p>
+            <w:r>
+              <w:t>Monitor reservations, restaurant occupancy, and order performance</w:t>
+            </w:r>
+          </w:p>
         </w:tc>
         <w:tc>
           <w:tcPr>
@@ -2327,7 +2435,11 @@
               <w:right w:w="100" w:type="dxa"/>
             </w:tcMar>
           </w:tcPr>
-          <w:p/>
+          <w:p>
+            <w:r>
+              <w:t>Dashboards showing reservation activity, table occupancy, wait times, completed orders, peak business hours, and performance reports of the restaurant.</w:t>
+            </w:r>
+          </w:p>
         </w:tc>
         <w:tc>
           <w:tcPr>
@@ -2339,7 +2451,11 @@
               <w:right w:w="100" w:type="dxa"/>
             </w:tcMar>
           </w:tcPr>
-          <w:p/>
+          <w:p>
+            <w:r>
+              <w:t>Assumed based on management responsibilities and research on restaurant management software.</w:t>
+            </w:r>
+          </w:p>
         </w:tc>
       </w:tr>
     </w:tbl>
@@ -2413,9 +2529,7 @@
           </w:tcPr>
           <w:p>
             <w:pPr>
-              <w:spacing w:after="60" w:line="260" w:lineRule="auto"/>
-            </w:pPr>
-            <w:r>
+              <w:spacing w:line="260" w:lineRule="auto"/>
               <w:rPr>
                 <w:i/>
                 <w:iCs/>
@@ -2423,19 +2537,283 @@
                 <w:sz w:val="19"/>
                 <w:szCs w:val="19"/>
               </w:rPr>
-              <w:lastRenderedPageBreak/>
-              <w:t>Type here.</w:t>
+            </w:pPr>
+            <w:r>
+              <w:rPr>
+                <w:i/>
+                <w:iCs/>
+                <w:color w:val="9AA3AE"/>
+                <w:sz w:val="19"/>
+                <w:szCs w:val="19"/>
+              </w:rPr>
+              <w:t xml:space="preserve">Customers: Restaurant guests use the system to reserve tables, check availability, modify reservations and view reservation status. Most customers can </w:t>
+            </w:r>
+            <w:r>
+              <w:rPr>
+                <w:i/>
+                <w:iCs/>
+                <w:color w:val="9AA3AE"/>
+                <w:sz w:val="19"/>
+                <w:szCs w:val="19"/>
+              </w:rPr>
+              <w:t>assume</w:t>
+            </w:r>
+            <w:r>
+              <w:rPr>
+                <w:i/>
+                <w:iCs/>
+                <w:color w:val="9AA3AE"/>
+                <w:sz w:val="19"/>
+                <w:szCs w:val="19"/>
+              </w:rPr>
+              <w:t xml:space="preserve"> to know how to use a smartphone app or website, but they cannot be assumed to understand restaurant operations or technical system features. Customers can access the system from mobile phones, tablets, or computers. Since many customers may make reservations quickly, the system must be easy to use with clear instructions. Basic accessibility features: readable text, clear buttons, and simple layouts should be used.</w:t>
             </w:r>
           </w:p>
           <w:p>
             <w:pPr>
               <w:spacing w:after="60" w:line="260" w:lineRule="auto"/>
+              <w:rPr>
+                <w:i/>
+                <w:iCs/>
+                <w:color w:val="9AA3AE"/>
+                <w:sz w:val="19"/>
+                <w:szCs w:val="19"/>
+              </w:rPr>
             </w:pPr>
           </w:p>
           <w:p>
             <w:pPr>
               <w:spacing w:after="60" w:line="260" w:lineRule="auto"/>
+              <w:rPr>
+                <w:i/>
+                <w:iCs/>
+                <w:color w:val="9AA3AE"/>
+                <w:sz w:val="19"/>
+                <w:szCs w:val="19"/>
+              </w:rPr>
             </w:pPr>
+            <w:r>
+              <w:rPr>
+                <w:i/>
+                <w:iCs/>
+                <w:color w:val="9AA3AE"/>
+                <w:sz w:val="19"/>
+                <w:szCs w:val="19"/>
+              </w:rPr>
+              <w:t xml:space="preserve">Hosts: Restaurant hosts are responsible for managing reservations, assigning tables, and checking </w:t>
+            </w:r>
+            <w:r>
+              <w:rPr>
+                <w:i/>
+                <w:iCs/>
+                <w:color w:val="9AA3AE"/>
+                <w:sz w:val="19"/>
+                <w:szCs w:val="19"/>
+              </w:rPr>
+              <w:t>on</w:t>
+            </w:r>
+            <w:r>
+              <w:rPr>
+                <w:i/>
+                <w:iCs/>
+                <w:color w:val="9AA3AE"/>
+                <w:sz w:val="19"/>
+                <w:szCs w:val="19"/>
+              </w:rPr>
+              <w:t xml:space="preserve"> arriving customers. They are expected to have basic computer skills and receive training on the system. They cannot be assumed to have advanced technical knowledge. Hosts usually use a desktop computer or tablet near the restaurant entrance. Because they work in busy environments and must get to customers quickly, the system should </w:t>
+            </w:r>
+            <w:r>
+              <w:rPr>
+                <w:i/>
+                <w:iCs/>
+                <w:color w:val="9AA3AE"/>
+                <w:sz w:val="19"/>
+                <w:szCs w:val="19"/>
+              </w:rPr>
+              <w:t>display</w:t>
+            </w:r>
+            <w:r>
+              <w:rPr>
+                <w:i/>
+                <w:iCs/>
+                <w:color w:val="9AA3AE"/>
+                <w:sz w:val="19"/>
+                <w:szCs w:val="19"/>
+              </w:rPr>
+              <w:t xml:space="preserve"> information</w:t>
+            </w:r>
+            <w:r>
+              <w:rPr>
+                <w:i/>
+                <w:iCs/>
+                <w:color w:val="9AA3AE"/>
+                <w:sz w:val="19"/>
+                <w:szCs w:val="19"/>
+              </w:rPr>
+              <w:t xml:space="preserve"> in real </w:t>
+            </w:r>
+            <w:r>
+              <w:rPr>
+                <w:i/>
+                <w:iCs/>
+                <w:color w:val="9AA3AE"/>
+                <w:sz w:val="19"/>
+                <w:szCs w:val="19"/>
+              </w:rPr>
+              <w:t>time and</w:t>
+            </w:r>
+            <w:r>
+              <w:rPr>
+                <w:i/>
+                <w:iCs/>
+                <w:color w:val="9AA3AE"/>
+                <w:sz w:val="19"/>
+                <w:szCs w:val="19"/>
+              </w:rPr>
+              <w:t xml:space="preserve"> allow common tasks to be completed with limited steps.</w:t>
+            </w:r>
+          </w:p>
+          <w:p>
+            <w:pPr>
+              <w:spacing w:after="60" w:line="260" w:lineRule="auto"/>
+              <w:rPr>
+                <w:i/>
+                <w:iCs/>
+                <w:color w:val="9AA3AE"/>
+                <w:sz w:val="19"/>
+                <w:szCs w:val="19"/>
+              </w:rPr>
+            </w:pPr>
+          </w:p>
+          <w:p>
+            <w:pPr>
+              <w:spacing w:line="260" w:lineRule="auto"/>
+              <w:rPr>
+                <w:i/>
+                <w:iCs/>
+                <w:color w:val="9AA3AE"/>
+                <w:sz w:val="19"/>
+                <w:szCs w:val="19"/>
+              </w:rPr>
+            </w:pPr>
+            <w:r>
+              <w:rPr>
+                <w:i/>
+                <w:iCs/>
+                <w:color w:val="9AA3AE"/>
+                <w:sz w:val="19"/>
+                <w:szCs w:val="19"/>
+              </w:rPr>
+              <w:t>Servers: Restaurant servers use the system to see table assignments, review customer orders, and check order status. Most servers can be assumed to have experience using touchscreen devices and restaurant technology, but not advanced technical expertise. Servers will likely</w:t>
+            </w:r>
+            <w:r>
+              <w:rPr>
+                <w:i/>
+                <w:iCs/>
+                <w:color w:val="9AA3AE"/>
+                <w:sz w:val="19"/>
+                <w:szCs w:val="19"/>
+              </w:rPr>
+              <w:t xml:space="preserve"> </w:t>
+            </w:r>
+            <w:r>
+              <w:rPr>
+                <w:i/>
+                <w:iCs/>
+                <w:color w:val="9AA3AE"/>
+                <w:sz w:val="19"/>
+                <w:szCs w:val="19"/>
+              </w:rPr>
+              <w:t xml:space="preserve">use tablets or restaurant terminals during their shifts. Since servers are frequently moving between tables and </w:t>
+            </w:r>
+            <w:r>
+              <w:rPr>
+                <w:i/>
+                <w:iCs/>
+                <w:color w:val="9AA3AE"/>
+                <w:sz w:val="19"/>
+                <w:szCs w:val="19"/>
+              </w:rPr>
+              <w:t>maybe</w:t>
+            </w:r>
+            <w:r>
+              <w:rPr>
+                <w:i/>
+                <w:iCs/>
+                <w:color w:val="9AA3AE"/>
+                <w:sz w:val="19"/>
+                <w:szCs w:val="19"/>
+              </w:rPr>
+              <w:t xml:space="preserve"> handling multiple customers at once, the system should allow fast access to information to prevent unnecessary navigation.</w:t>
+            </w:r>
+          </w:p>
+          <w:p>
+            <w:pPr>
+              <w:spacing w:after="60" w:line="260" w:lineRule="auto"/>
+              <w:rPr>
+                <w:i/>
+                <w:iCs/>
+                <w:color w:val="9AA3AE"/>
+                <w:sz w:val="19"/>
+                <w:szCs w:val="19"/>
+              </w:rPr>
+            </w:pPr>
+          </w:p>
+          <w:p>
+            <w:pPr>
+              <w:spacing w:after="60" w:line="260" w:lineRule="auto"/>
+              <w:rPr>
+                <w:i/>
+                <w:iCs/>
+                <w:color w:val="9AA3AE"/>
+                <w:sz w:val="19"/>
+                <w:szCs w:val="19"/>
+              </w:rPr>
+            </w:pPr>
+            <w:r>
+              <w:rPr>
+                <w:i/>
+                <w:iCs/>
+                <w:color w:val="9AA3AE"/>
+                <w:sz w:val="19"/>
+                <w:szCs w:val="19"/>
+              </w:rPr>
+              <w:t>Kitchen Staff: Restaurant kitchen staff use the system to receive, track, and update food orders. They can be assumed to understand restaurant order workflows but may have different levels of computer experience. Kitchen staff usually use a kitchen display screen or terminal. Because the kitchen environment is fast paced and time sensitive, order information must be presented clearly, accurately, and in a format that is easy to read. The system should reduce clutter and make important updates the priority.</w:t>
+            </w:r>
+          </w:p>
+          <w:p>
+            <w:pPr>
+              <w:spacing w:after="60" w:line="260" w:lineRule="auto"/>
+              <w:rPr>
+                <w:i/>
+                <w:iCs/>
+                <w:color w:val="9AA3AE"/>
+                <w:sz w:val="19"/>
+                <w:szCs w:val="19"/>
+              </w:rPr>
+            </w:pPr>
+          </w:p>
+          <w:p>
+            <w:pPr>
+              <w:spacing w:after="60" w:line="260" w:lineRule="auto"/>
+              <w:rPr>
+                <w:i/>
+                <w:iCs/>
+                <w:color w:val="9AA3AE"/>
+                <w:sz w:val="19"/>
+                <w:szCs w:val="19"/>
+              </w:rPr>
+            </w:pPr>
+            <w:r>
+              <w:rPr>
+                <w:i/>
+                <w:iCs/>
+                <w:color w:val="9AA3AE"/>
+                <w:sz w:val="19"/>
+                <w:szCs w:val="19"/>
+              </w:rPr>
+              <w:t>Restaurant Managers: Restaurant managers use the system to monitor reservations, occupancy levels, order activity, and restaurant performance. Managers are expected to have moderate experience with business software and reporting tools. They could access the system through desktop computers, tablets, or laptops. Managers often need to make operational decisions quickly, so the system should provide organized reports, dashboards, and summary information that is easy to understand.</w:t>
+            </w:r>
           </w:p>
         </w:tc>
       </w:tr>
@@ -2458,6 +2836,7 @@
           <w:sz w:val="22"/>
           <w:szCs w:val="22"/>
         </w:rPr>
+        <w:lastRenderedPageBreak/>
         <w:t xml:space="preserve">2.4   </w:t>
       </w:r>
       <w:r>
@@ -3667,291 +4046,291 @@
                 <w:sz w:val="18"/>
                 <w:szCs w:val="18"/>
               </w:rPr>
+              <w:t>FR-04</w:t>
+            </w:r>
+          </w:p>
+        </w:tc>
+        <w:tc>
+          <w:tcPr>
+            <w:tcW w:w="4000" w:type="dxa"/>
+            <w:tcMar>
+              <w:top w:w="70" w:type="dxa"/>
+              <w:left w:w="100" w:type="dxa"/>
+              <w:bottom w:w="70" w:type="dxa"/>
+              <w:right w:w="100" w:type="dxa"/>
+            </w:tcMar>
+          </w:tcPr>
+          <w:p/>
+        </w:tc>
+        <w:tc>
+          <w:tcPr>
+            <w:tcW w:w="1100" w:type="dxa"/>
+            <w:tcMar>
+              <w:top w:w="70" w:type="dxa"/>
+              <w:left w:w="100" w:type="dxa"/>
+              <w:bottom w:w="70" w:type="dxa"/>
+              <w:right w:w="100" w:type="dxa"/>
+            </w:tcMar>
+          </w:tcPr>
+          <w:p/>
+        </w:tc>
+        <w:tc>
+          <w:tcPr>
+            <w:tcW w:w="1300" w:type="dxa"/>
+            <w:tcMar>
+              <w:top w:w="70" w:type="dxa"/>
+              <w:left w:w="100" w:type="dxa"/>
+              <w:bottom w:w="70" w:type="dxa"/>
+              <w:right w:w="100" w:type="dxa"/>
+            </w:tcMar>
+          </w:tcPr>
+          <w:p/>
+        </w:tc>
+        <w:tc>
+          <w:tcPr>
+            <w:tcW w:w="3658" w:type="dxa"/>
+            <w:tcMar>
+              <w:top w:w="70" w:type="dxa"/>
+              <w:left w:w="100" w:type="dxa"/>
+              <w:bottom w:w="70" w:type="dxa"/>
+              <w:right w:w="100" w:type="dxa"/>
+            </w:tcMar>
+          </w:tcPr>
+          <w:p/>
+        </w:tc>
+      </w:tr>
+      <w:tr>
+        <w:tc>
+          <w:tcPr>
+            <w:tcW w:w="800" w:type="dxa"/>
+            <w:tcMar>
+              <w:top w:w="70" w:type="dxa"/>
+              <w:left w:w="100" w:type="dxa"/>
+              <w:bottom w:w="70" w:type="dxa"/>
+              <w:right w:w="100" w:type="dxa"/>
+            </w:tcMar>
+          </w:tcPr>
+          <w:p>
+            <w:r>
+              <w:rPr>
+                <w:color w:val="1A1A1A"/>
+                <w:sz w:val="18"/>
+                <w:szCs w:val="18"/>
+              </w:rPr>
+              <w:t>FR-05</w:t>
+            </w:r>
+          </w:p>
+        </w:tc>
+        <w:tc>
+          <w:tcPr>
+            <w:tcW w:w="4000" w:type="dxa"/>
+            <w:tcMar>
+              <w:top w:w="70" w:type="dxa"/>
+              <w:left w:w="100" w:type="dxa"/>
+              <w:bottom w:w="70" w:type="dxa"/>
+              <w:right w:w="100" w:type="dxa"/>
+            </w:tcMar>
+          </w:tcPr>
+          <w:p/>
+        </w:tc>
+        <w:tc>
+          <w:tcPr>
+            <w:tcW w:w="1100" w:type="dxa"/>
+            <w:tcMar>
+              <w:top w:w="70" w:type="dxa"/>
+              <w:left w:w="100" w:type="dxa"/>
+              <w:bottom w:w="70" w:type="dxa"/>
+              <w:right w:w="100" w:type="dxa"/>
+            </w:tcMar>
+          </w:tcPr>
+          <w:p/>
+        </w:tc>
+        <w:tc>
+          <w:tcPr>
+            <w:tcW w:w="1300" w:type="dxa"/>
+            <w:tcMar>
+              <w:top w:w="70" w:type="dxa"/>
+              <w:left w:w="100" w:type="dxa"/>
+              <w:bottom w:w="70" w:type="dxa"/>
+              <w:right w:w="100" w:type="dxa"/>
+            </w:tcMar>
+          </w:tcPr>
+          <w:p/>
+        </w:tc>
+        <w:tc>
+          <w:tcPr>
+            <w:tcW w:w="3658" w:type="dxa"/>
+            <w:tcMar>
+              <w:top w:w="70" w:type="dxa"/>
+              <w:left w:w="100" w:type="dxa"/>
+              <w:bottom w:w="70" w:type="dxa"/>
+              <w:right w:w="100" w:type="dxa"/>
+            </w:tcMar>
+          </w:tcPr>
+          <w:p/>
+        </w:tc>
+      </w:tr>
+      <w:tr>
+        <w:tc>
+          <w:tcPr>
+            <w:tcW w:w="800" w:type="dxa"/>
+            <w:tcMar>
+              <w:top w:w="70" w:type="dxa"/>
+              <w:left w:w="100" w:type="dxa"/>
+              <w:bottom w:w="70" w:type="dxa"/>
+              <w:right w:w="100" w:type="dxa"/>
+            </w:tcMar>
+          </w:tcPr>
+          <w:p>
+            <w:r>
+              <w:rPr>
+                <w:color w:val="1A1A1A"/>
+                <w:sz w:val="18"/>
+                <w:szCs w:val="18"/>
+              </w:rPr>
+              <w:t>FR-06</w:t>
+            </w:r>
+          </w:p>
+        </w:tc>
+        <w:tc>
+          <w:tcPr>
+            <w:tcW w:w="4000" w:type="dxa"/>
+            <w:tcMar>
+              <w:top w:w="70" w:type="dxa"/>
+              <w:left w:w="100" w:type="dxa"/>
+              <w:bottom w:w="70" w:type="dxa"/>
+              <w:right w:w="100" w:type="dxa"/>
+            </w:tcMar>
+          </w:tcPr>
+          <w:p/>
+        </w:tc>
+        <w:tc>
+          <w:tcPr>
+            <w:tcW w:w="1100" w:type="dxa"/>
+            <w:tcMar>
+              <w:top w:w="70" w:type="dxa"/>
+              <w:left w:w="100" w:type="dxa"/>
+              <w:bottom w:w="70" w:type="dxa"/>
+              <w:right w:w="100" w:type="dxa"/>
+            </w:tcMar>
+          </w:tcPr>
+          <w:p/>
+        </w:tc>
+        <w:tc>
+          <w:tcPr>
+            <w:tcW w:w="1300" w:type="dxa"/>
+            <w:tcMar>
+              <w:top w:w="70" w:type="dxa"/>
+              <w:left w:w="100" w:type="dxa"/>
+              <w:bottom w:w="70" w:type="dxa"/>
+              <w:right w:w="100" w:type="dxa"/>
+            </w:tcMar>
+          </w:tcPr>
+          <w:p/>
+        </w:tc>
+        <w:tc>
+          <w:tcPr>
+            <w:tcW w:w="3658" w:type="dxa"/>
+            <w:tcMar>
+              <w:top w:w="70" w:type="dxa"/>
+              <w:left w:w="100" w:type="dxa"/>
+              <w:bottom w:w="70" w:type="dxa"/>
+              <w:right w:w="100" w:type="dxa"/>
+            </w:tcMar>
+          </w:tcPr>
+          <w:p/>
+        </w:tc>
+      </w:tr>
+      <w:tr>
+        <w:tc>
+          <w:tcPr>
+            <w:tcW w:w="800" w:type="dxa"/>
+            <w:tcMar>
+              <w:top w:w="70" w:type="dxa"/>
+              <w:left w:w="100" w:type="dxa"/>
+              <w:bottom w:w="70" w:type="dxa"/>
+              <w:right w:w="100" w:type="dxa"/>
+            </w:tcMar>
+          </w:tcPr>
+          <w:p>
+            <w:r>
+              <w:rPr>
+                <w:color w:val="1A1A1A"/>
+                <w:sz w:val="18"/>
+                <w:szCs w:val="18"/>
+              </w:rPr>
+              <w:t>FR-07</w:t>
+            </w:r>
+          </w:p>
+        </w:tc>
+        <w:tc>
+          <w:tcPr>
+            <w:tcW w:w="4000" w:type="dxa"/>
+            <w:tcMar>
+              <w:top w:w="70" w:type="dxa"/>
+              <w:left w:w="100" w:type="dxa"/>
+              <w:bottom w:w="70" w:type="dxa"/>
+              <w:right w:w="100" w:type="dxa"/>
+            </w:tcMar>
+          </w:tcPr>
+          <w:p/>
+        </w:tc>
+        <w:tc>
+          <w:tcPr>
+            <w:tcW w:w="1100" w:type="dxa"/>
+            <w:tcMar>
+              <w:top w:w="70" w:type="dxa"/>
+              <w:left w:w="100" w:type="dxa"/>
+              <w:bottom w:w="70" w:type="dxa"/>
+              <w:right w:w="100" w:type="dxa"/>
+            </w:tcMar>
+          </w:tcPr>
+          <w:p/>
+        </w:tc>
+        <w:tc>
+          <w:tcPr>
+            <w:tcW w:w="1300" w:type="dxa"/>
+            <w:tcMar>
+              <w:top w:w="70" w:type="dxa"/>
+              <w:left w:w="100" w:type="dxa"/>
+              <w:bottom w:w="70" w:type="dxa"/>
+              <w:right w:w="100" w:type="dxa"/>
+            </w:tcMar>
+          </w:tcPr>
+          <w:p/>
+        </w:tc>
+        <w:tc>
+          <w:tcPr>
+            <w:tcW w:w="3658" w:type="dxa"/>
+            <w:tcMar>
+              <w:top w:w="70" w:type="dxa"/>
+              <w:left w:w="100" w:type="dxa"/>
+              <w:bottom w:w="70" w:type="dxa"/>
+              <w:right w:w="100" w:type="dxa"/>
+            </w:tcMar>
+          </w:tcPr>
+          <w:p/>
+        </w:tc>
+      </w:tr>
+      <w:tr>
+        <w:tc>
+          <w:tcPr>
+            <w:tcW w:w="800" w:type="dxa"/>
+            <w:tcMar>
+              <w:top w:w="70" w:type="dxa"/>
+              <w:left w:w="100" w:type="dxa"/>
+              <w:bottom w:w="70" w:type="dxa"/>
+              <w:right w:w="100" w:type="dxa"/>
+            </w:tcMar>
+          </w:tcPr>
+          <w:p>
+            <w:r>
+              <w:rPr>
+                <w:color w:val="1A1A1A"/>
+                <w:sz w:val="18"/>
+                <w:szCs w:val="18"/>
+              </w:rPr>
               <w:lastRenderedPageBreak/>
-              <w:t>FR-04</w:t>
-            </w:r>
-          </w:p>
-        </w:tc>
-        <w:tc>
-          <w:tcPr>
-            <w:tcW w:w="4000" w:type="dxa"/>
-            <w:tcMar>
-              <w:top w:w="70" w:type="dxa"/>
-              <w:left w:w="100" w:type="dxa"/>
-              <w:bottom w:w="70" w:type="dxa"/>
-              <w:right w:w="100" w:type="dxa"/>
-            </w:tcMar>
-          </w:tcPr>
-          <w:p/>
-        </w:tc>
-        <w:tc>
-          <w:tcPr>
-            <w:tcW w:w="1100" w:type="dxa"/>
-            <w:tcMar>
-              <w:top w:w="70" w:type="dxa"/>
-              <w:left w:w="100" w:type="dxa"/>
-              <w:bottom w:w="70" w:type="dxa"/>
-              <w:right w:w="100" w:type="dxa"/>
-            </w:tcMar>
-          </w:tcPr>
-          <w:p/>
-        </w:tc>
-        <w:tc>
-          <w:tcPr>
-            <w:tcW w:w="1300" w:type="dxa"/>
-            <w:tcMar>
-              <w:top w:w="70" w:type="dxa"/>
-              <w:left w:w="100" w:type="dxa"/>
-              <w:bottom w:w="70" w:type="dxa"/>
-              <w:right w:w="100" w:type="dxa"/>
-            </w:tcMar>
-          </w:tcPr>
-          <w:p/>
-        </w:tc>
-        <w:tc>
-          <w:tcPr>
-            <w:tcW w:w="3658" w:type="dxa"/>
-            <w:tcMar>
-              <w:top w:w="70" w:type="dxa"/>
-              <w:left w:w="100" w:type="dxa"/>
-              <w:bottom w:w="70" w:type="dxa"/>
-              <w:right w:w="100" w:type="dxa"/>
-            </w:tcMar>
-          </w:tcPr>
-          <w:p/>
-        </w:tc>
-      </w:tr>
-      <w:tr>
-        <w:tc>
-          <w:tcPr>
-            <w:tcW w:w="800" w:type="dxa"/>
-            <w:tcMar>
-              <w:top w:w="70" w:type="dxa"/>
-              <w:left w:w="100" w:type="dxa"/>
-              <w:bottom w:w="70" w:type="dxa"/>
-              <w:right w:w="100" w:type="dxa"/>
-            </w:tcMar>
-          </w:tcPr>
-          <w:p>
-            <w:r>
-              <w:rPr>
-                <w:color w:val="1A1A1A"/>
-                <w:sz w:val="18"/>
-                <w:szCs w:val="18"/>
-              </w:rPr>
-              <w:t>FR-05</w:t>
-            </w:r>
-          </w:p>
-        </w:tc>
-        <w:tc>
-          <w:tcPr>
-            <w:tcW w:w="4000" w:type="dxa"/>
-            <w:tcMar>
-              <w:top w:w="70" w:type="dxa"/>
-              <w:left w:w="100" w:type="dxa"/>
-              <w:bottom w:w="70" w:type="dxa"/>
-              <w:right w:w="100" w:type="dxa"/>
-            </w:tcMar>
-          </w:tcPr>
-          <w:p/>
-        </w:tc>
-        <w:tc>
-          <w:tcPr>
-            <w:tcW w:w="1100" w:type="dxa"/>
-            <w:tcMar>
-              <w:top w:w="70" w:type="dxa"/>
-              <w:left w:w="100" w:type="dxa"/>
-              <w:bottom w:w="70" w:type="dxa"/>
-              <w:right w:w="100" w:type="dxa"/>
-            </w:tcMar>
-          </w:tcPr>
-          <w:p/>
-        </w:tc>
-        <w:tc>
-          <w:tcPr>
-            <w:tcW w:w="1300" w:type="dxa"/>
-            <w:tcMar>
-              <w:top w:w="70" w:type="dxa"/>
-              <w:left w:w="100" w:type="dxa"/>
-              <w:bottom w:w="70" w:type="dxa"/>
-              <w:right w:w="100" w:type="dxa"/>
-            </w:tcMar>
-          </w:tcPr>
-          <w:p/>
-        </w:tc>
-        <w:tc>
-          <w:tcPr>
-            <w:tcW w:w="3658" w:type="dxa"/>
-            <w:tcMar>
-              <w:top w:w="70" w:type="dxa"/>
-              <w:left w:w="100" w:type="dxa"/>
-              <w:bottom w:w="70" w:type="dxa"/>
-              <w:right w:w="100" w:type="dxa"/>
-            </w:tcMar>
-          </w:tcPr>
-          <w:p/>
-        </w:tc>
-      </w:tr>
-      <w:tr>
-        <w:tc>
-          <w:tcPr>
-            <w:tcW w:w="800" w:type="dxa"/>
-            <w:tcMar>
-              <w:top w:w="70" w:type="dxa"/>
-              <w:left w:w="100" w:type="dxa"/>
-              <w:bottom w:w="70" w:type="dxa"/>
-              <w:right w:w="100" w:type="dxa"/>
-            </w:tcMar>
-          </w:tcPr>
-          <w:p>
-            <w:r>
-              <w:rPr>
-                <w:color w:val="1A1A1A"/>
-                <w:sz w:val="18"/>
-                <w:szCs w:val="18"/>
-              </w:rPr>
-              <w:t>FR-06</w:t>
-            </w:r>
-          </w:p>
-        </w:tc>
-        <w:tc>
-          <w:tcPr>
-            <w:tcW w:w="4000" w:type="dxa"/>
-            <w:tcMar>
-              <w:top w:w="70" w:type="dxa"/>
-              <w:left w:w="100" w:type="dxa"/>
-              <w:bottom w:w="70" w:type="dxa"/>
-              <w:right w:w="100" w:type="dxa"/>
-            </w:tcMar>
-          </w:tcPr>
-          <w:p/>
-        </w:tc>
-        <w:tc>
-          <w:tcPr>
-            <w:tcW w:w="1100" w:type="dxa"/>
-            <w:tcMar>
-              <w:top w:w="70" w:type="dxa"/>
-              <w:left w:w="100" w:type="dxa"/>
-              <w:bottom w:w="70" w:type="dxa"/>
-              <w:right w:w="100" w:type="dxa"/>
-            </w:tcMar>
-          </w:tcPr>
-          <w:p/>
-        </w:tc>
-        <w:tc>
-          <w:tcPr>
-            <w:tcW w:w="1300" w:type="dxa"/>
-            <w:tcMar>
-              <w:top w:w="70" w:type="dxa"/>
-              <w:left w:w="100" w:type="dxa"/>
-              <w:bottom w:w="70" w:type="dxa"/>
-              <w:right w:w="100" w:type="dxa"/>
-            </w:tcMar>
-          </w:tcPr>
-          <w:p/>
-        </w:tc>
-        <w:tc>
-          <w:tcPr>
-            <w:tcW w:w="3658" w:type="dxa"/>
-            <w:tcMar>
-              <w:top w:w="70" w:type="dxa"/>
-              <w:left w:w="100" w:type="dxa"/>
-              <w:bottom w:w="70" w:type="dxa"/>
-              <w:right w:w="100" w:type="dxa"/>
-            </w:tcMar>
-          </w:tcPr>
-          <w:p/>
-        </w:tc>
-      </w:tr>
-      <w:tr>
-        <w:tc>
-          <w:tcPr>
-            <w:tcW w:w="800" w:type="dxa"/>
-            <w:tcMar>
-              <w:top w:w="70" w:type="dxa"/>
-              <w:left w:w="100" w:type="dxa"/>
-              <w:bottom w:w="70" w:type="dxa"/>
-              <w:right w:w="100" w:type="dxa"/>
-            </w:tcMar>
-          </w:tcPr>
-          <w:p>
-            <w:r>
-              <w:rPr>
-                <w:color w:val="1A1A1A"/>
-                <w:sz w:val="18"/>
-                <w:szCs w:val="18"/>
-              </w:rPr>
-              <w:t>FR-07</w:t>
-            </w:r>
-          </w:p>
-        </w:tc>
-        <w:tc>
-          <w:tcPr>
-            <w:tcW w:w="4000" w:type="dxa"/>
-            <w:tcMar>
-              <w:top w:w="70" w:type="dxa"/>
-              <w:left w:w="100" w:type="dxa"/>
-              <w:bottom w:w="70" w:type="dxa"/>
-              <w:right w:w="100" w:type="dxa"/>
-            </w:tcMar>
-          </w:tcPr>
-          <w:p/>
-        </w:tc>
-        <w:tc>
-          <w:tcPr>
-            <w:tcW w:w="1100" w:type="dxa"/>
-            <w:tcMar>
-              <w:top w:w="70" w:type="dxa"/>
-              <w:left w:w="100" w:type="dxa"/>
-              <w:bottom w:w="70" w:type="dxa"/>
-              <w:right w:w="100" w:type="dxa"/>
-            </w:tcMar>
-          </w:tcPr>
-          <w:p/>
-        </w:tc>
-        <w:tc>
-          <w:tcPr>
-            <w:tcW w:w="1300" w:type="dxa"/>
-            <w:tcMar>
-              <w:top w:w="70" w:type="dxa"/>
-              <w:left w:w="100" w:type="dxa"/>
-              <w:bottom w:w="70" w:type="dxa"/>
-              <w:right w:w="100" w:type="dxa"/>
-            </w:tcMar>
-          </w:tcPr>
-          <w:p/>
-        </w:tc>
-        <w:tc>
-          <w:tcPr>
-            <w:tcW w:w="3658" w:type="dxa"/>
-            <w:tcMar>
-              <w:top w:w="70" w:type="dxa"/>
-              <w:left w:w="100" w:type="dxa"/>
-              <w:bottom w:w="70" w:type="dxa"/>
-              <w:right w:w="100" w:type="dxa"/>
-            </w:tcMar>
-          </w:tcPr>
-          <w:p/>
-        </w:tc>
-      </w:tr>
-      <w:tr>
-        <w:tc>
-          <w:tcPr>
-            <w:tcW w:w="800" w:type="dxa"/>
-            <w:tcMar>
-              <w:top w:w="70" w:type="dxa"/>
-              <w:left w:w="100" w:type="dxa"/>
-              <w:bottom w:w="70" w:type="dxa"/>
-              <w:right w:w="100" w:type="dxa"/>
-            </w:tcMar>
-          </w:tcPr>
-          <w:p>
-            <w:r>
-              <w:rPr>
-                <w:color w:val="1A1A1A"/>
-                <w:sz w:val="18"/>
-                <w:szCs w:val="18"/>
-              </w:rPr>
               <w:t>FR-08</w:t>
             </w:r>
           </w:p>
@@ -5153,147 +5532,147 @@
                 <w:sz w:val="18"/>
                 <w:szCs w:val="18"/>
               </w:rPr>
+              <w:t>Trigger — what starts it</w:t>
+            </w:r>
+          </w:p>
+        </w:tc>
+        <w:tc>
+          <w:tcPr>
+            <w:tcW w:w="8258" w:type="dxa"/>
+            <w:tcMar>
+              <w:top w:w="70" w:type="dxa"/>
+              <w:left w:w="100" w:type="dxa"/>
+              <w:bottom w:w="70" w:type="dxa"/>
+              <w:right w:w="100" w:type="dxa"/>
+            </w:tcMar>
+          </w:tcPr>
+          <w:p/>
+        </w:tc>
+      </w:tr>
+      <w:tr>
+        <w:tc>
+          <w:tcPr>
+            <w:tcW w:w="2600" w:type="dxa"/>
+            <w:tcMar>
+              <w:top w:w="70" w:type="dxa"/>
+              <w:left w:w="100" w:type="dxa"/>
+              <w:bottom w:w="70" w:type="dxa"/>
+              <w:right w:w="100" w:type="dxa"/>
+            </w:tcMar>
+          </w:tcPr>
+          <w:p>
+            <w:r>
+              <w:rPr>
+                <w:color w:val="1A1A1A"/>
+                <w:sz w:val="18"/>
+                <w:szCs w:val="18"/>
+              </w:rPr>
+              <w:t>Main success scenario — numbered steps</w:t>
+            </w:r>
+          </w:p>
+        </w:tc>
+        <w:tc>
+          <w:tcPr>
+            <w:tcW w:w="8258" w:type="dxa"/>
+            <w:tcMar>
+              <w:top w:w="70" w:type="dxa"/>
+              <w:left w:w="100" w:type="dxa"/>
+              <w:bottom w:w="70" w:type="dxa"/>
+              <w:right w:w="100" w:type="dxa"/>
+            </w:tcMar>
+          </w:tcPr>
+          <w:p/>
+        </w:tc>
+      </w:tr>
+      <w:tr>
+        <w:tc>
+          <w:tcPr>
+            <w:tcW w:w="2600" w:type="dxa"/>
+            <w:tcMar>
+              <w:top w:w="70" w:type="dxa"/>
+              <w:left w:w="100" w:type="dxa"/>
+              <w:bottom w:w="70" w:type="dxa"/>
+              <w:right w:w="100" w:type="dxa"/>
+            </w:tcMar>
+          </w:tcPr>
+          <w:p>
+            <w:r>
+              <w:rPr>
+                <w:color w:val="1A1A1A"/>
+                <w:sz w:val="18"/>
+                <w:szCs w:val="18"/>
+              </w:rPr>
+              <w:t>Alternative and exception flows</w:t>
+            </w:r>
+          </w:p>
+        </w:tc>
+        <w:tc>
+          <w:tcPr>
+            <w:tcW w:w="8258" w:type="dxa"/>
+            <w:tcMar>
+              <w:top w:w="70" w:type="dxa"/>
+              <w:left w:w="100" w:type="dxa"/>
+              <w:bottom w:w="70" w:type="dxa"/>
+              <w:right w:w="100" w:type="dxa"/>
+            </w:tcMar>
+          </w:tcPr>
+          <w:p/>
+        </w:tc>
+      </w:tr>
+      <w:tr>
+        <w:tc>
+          <w:tcPr>
+            <w:tcW w:w="2600" w:type="dxa"/>
+            <w:tcMar>
+              <w:top w:w="70" w:type="dxa"/>
+              <w:left w:w="100" w:type="dxa"/>
+              <w:bottom w:w="70" w:type="dxa"/>
+              <w:right w:w="100" w:type="dxa"/>
+            </w:tcMar>
+          </w:tcPr>
+          <w:p>
+            <w:r>
+              <w:rPr>
+                <w:color w:val="1A1A1A"/>
+                <w:sz w:val="18"/>
+                <w:szCs w:val="18"/>
+              </w:rPr>
+              <w:t>Postconditions — what is true when it succeeds</w:t>
+            </w:r>
+          </w:p>
+        </w:tc>
+        <w:tc>
+          <w:tcPr>
+            <w:tcW w:w="8258" w:type="dxa"/>
+            <w:tcMar>
+              <w:top w:w="70" w:type="dxa"/>
+              <w:left w:w="100" w:type="dxa"/>
+              <w:bottom w:w="70" w:type="dxa"/>
+              <w:right w:w="100" w:type="dxa"/>
+            </w:tcMar>
+          </w:tcPr>
+          <w:p/>
+        </w:tc>
+      </w:tr>
+      <w:tr>
+        <w:tc>
+          <w:tcPr>
+            <w:tcW w:w="2600" w:type="dxa"/>
+            <w:tcMar>
+              <w:top w:w="70" w:type="dxa"/>
+              <w:left w:w="100" w:type="dxa"/>
+              <w:bottom w:w="70" w:type="dxa"/>
+              <w:right w:w="100" w:type="dxa"/>
+            </w:tcMar>
+          </w:tcPr>
+          <w:p>
+            <w:r>
+              <w:rPr>
+                <w:color w:val="1A1A1A"/>
+                <w:sz w:val="18"/>
+                <w:szCs w:val="18"/>
+              </w:rPr>
               <w:lastRenderedPageBreak/>
-              <w:t>Trigger — what starts it</w:t>
-            </w:r>
-          </w:p>
-        </w:tc>
-        <w:tc>
-          <w:tcPr>
-            <w:tcW w:w="8258" w:type="dxa"/>
-            <w:tcMar>
-              <w:top w:w="70" w:type="dxa"/>
-              <w:left w:w="100" w:type="dxa"/>
-              <w:bottom w:w="70" w:type="dxa"/>
-              <w:right w:w="100" w:type="dxa"/>
-            </w:tcMar>
-          </w:tcPr>
-          <w:p/>
-        </w:tc>
-      </w:tr>
-      <w:tr>
-        <w:tc>
-          <w:tcPr>
-            <w:tcW w:w="2600" w:type="dxa"/>
-            <w:tcMar>
-              <w:top w:w="70" w:type="dxa"/>
-              <w:left w:w="100" w:type="dxa"/>
-              <w:bottom w:w="70" w:type="dxa"/>
-              <w:right w:w="100" w:type="dxa"/>
-            </w:tcMar>
-          </w:tcPr>
-          <w:p>
-            <w:r>
-              <w:rPr>
-                <w:color w:val="1A1A1A"/>
-                <w:sz w:val="18"/>
-                <w:szCs w:val="18"/>
-              </w:rPr>
-              <w:t>Main success scenario — numbered steps</w:t>
-            </w:r>
-          </w:p>
-        </w:tc>
-        <w:tc>
-          <w:tcPr>
-            <w:tcW w:w="8258" w:type="dxa"/>
-            <w:tcMar>
-              <w:top w:w="70" w:type="dxa"/>
-              <w:left w:w="100" w:type="dxa"/>
-              <w:bottom w:w="70" w:type="dxa"/>
-              <w:right w:w="100" w:type="dxa"/>
-            </w:tcMar>
-          </w:tcPr>
-          <w:p/>
-        </w:tc>
-      </w:tr>
-      <w:tr>
-        <w:tc>
-          <w:tcPr>
-            <w:tcW w:w="2600" w:type="dxa"/>
-            <w:tcMar>
-              <w:top w:w="70" w:type="dxa"/>
-              <w:left w:w="100" w:type="dxa"/>
-              <w:bottom w:w="70" w:type="dxa"/>
-              <w:right w:w="100" w:type="dxa"/>
-            </w:tcMar>
-          </w:tcPr>
-          <w:p>
-            <w:r>
-              <w:rPr>
-                <w:color w:val="1A1A1A"/>
-                <w:sz w:val="18"/>
-                <w:szCs w:val="18"/>
-              </w:rPr>
-              <w:t>Alternative and exception flows</w:t>
-            </w:r>
-          </w:p>
-        </w:tc>
-        <w:tc>
-          <w:tcPr>
-            <w:tcW w:w="8258" w:type="dxa"/>
-            <w:tcMar>
-              <w:top w:w="70" w:type="dxa"/>
-              <w:left w:w="100" w:type="dxa"/>
-              <w:bottom w:w="70" w:type="dxa"/>
-              <w:right w:w="100" w:type="dxa"/>
-            </w:tcMar>
-          </w:tcPr>
-          <w:p/>
-        </w:tc>
-      </w:tr>
-      <w:tr>
-        <w:tc>
-          <w:tcPr>
-            <w:tcW w:w="2600" w:type="dxa"/>
-            <w:tcMar>
-              <w:top w:w="70" w:type="dxa"/>
-              <w:left w:w="100" w:type="dxa"/>
-              <w:bottom w:w="70" w:type="dxa"/>
-              <w:right w:w="100" w:type="dxa"/>
-            </w:tcMar>
-          </w:tcPr>
-          <w:p>
-            <w:r>
-              <w:rPr>
-                <w:color w:val="1A1A1A"/>
-                <w:sz w:val="18"/>
-                <w:szCs w:val="18"/>
-              </w:rPr>
-              <w:t>Postconditions — what is true when it succeeds</w:t>
-            </w:r>
-          </w:p>
-        </w:tc>
-        <w:tc>
-          <w:tcPr>
-            <w:tcW w:w="8258" w:type="dxa"/>
-            <w:tcMar>
-              <w:top w:w="70" w:type="dxa"/>
-              <w:left w:w="100" w:type="dxa"/>
-              <w:bottom w:w="70" w:type="dxa"/>
-              <w:right w:w="100" w:type="dxa"/>
-            </w:tcMar>
-          </w:tcPr>
-          <w:p/>
-        </w:tc>
-      </w:tr>
-      <w:tr>
-        <w:tc>
-          <w:tcPr>
-            <w:tcW w:w="2600" w:type="dxa"/>
-            <w:tcMar>
-              <w:top w:w="70" w:type="dxa"/>
-              <w:left w:w="100" w:type="dxa"/>
-              <w:bottom w:w="70" w:type="dxa"/>
-              <w:right w:w="100" w:type="dxa"/>
-            </w:tcMar>
-          </w:tcPr>
-          <w:p>
-            <w:r>
-              <w:rPr>
-                <w:color w:val="1A1A1A"/>
-                <w:sz w:val="18"/>
-                <w:szCs w:val="18"/>
-              </w:rPr>
               <w:t>Requirements realised</w:t>
             </w:r>
           </w:p>
@@ -6510,6 +6889,7 @@
                 <w:sz w:val="18"/>
                 <w:szCs w:val="18"/>
               </w:rPr>
+              <w:lastRenderedPageBreak/>
               <w:t>#</w:t>
             </w:r>
           </w:p>
@@ -7838,7 +8218,6 @@
           <w:color w:val="16324F"/>
           <w:sz w:val="26"/>
           <w:szCs w:val="26"/>
-          <w:lang w:val="en-US"/>
         </w:rPr>
       </w:pPr>
       <w:r>
@@ -7850,7 +8229,6 @@
           <w:sz w:val="26"/>
           <w:szCs w:val="26"/>
         </w:rPr>
-        <w:lastRenderedPageBreak/>
         <w:t xml:space="preserve">6   </w:t>
       </w:r>
       <w:r>
@@ -7879,7 +8257,6 @@
           <w:color w:val="16324F"/>
           <w:sz w:val="26"/>
           <w:szCs w:val="26"/>
-          <w:lang w:val="en-US"/>
         </w:rPr>
       </w:pPr>
     </w:p>
@@ -8862,7 +9239,7 @@
 </file>
 
 <file path=word/endnotes.xml><?xml version="1.0" encoding="utf-8"?>
-<w:endnotes xmlns:wpc="http://schemas.microsoft.com/office/word/2010/wordprocessingCanvas" xmlns:cx="http://schemas.microsoft.com/office/drawing/2014/chartex" xmlns:cx1="http://schemas.microsoft.com/office/drawing/2015/9/8/chartex" xmlns:cx2="http://schemas.microsoft.com/office/drawing/2015/10/21/chartex" xmlns:cx3="http://schemas.microsoft.com/office/drawing/2016/5/9/chartex" xmlns:cx4="http://schemas.microsoft.com/office/drawing/2016/5/10/chartex" xmlns:cx5="http://schemas.microsoft.com/office/drawing/2016/5/11/chartex" xmlns:cx6="http://schemas.microsoft.com/office/drawing/2016/5/12/chartex" xmlns:cx7="http://schemas.microsoft.com/office/drawing/2016/5/13/chartex" xmlns:cx8="http://schemas.microsoft.com/office/drawing/2016/5/14/chartex" xmlns:mc="http://schemas.openxmlformats.org/markup-compatibility/2006" xmlns:aink="http://schemas.microsoft.com/office/drawing/2016/ink" xmlns:am3d="http://schemas.microsoft.com/office/drawing/2017/model3d" xmlns:o="urn:schemas-microsoft-com:office:office" xmlns:oel="http://schemas.microsoft.com/office/2019/extlst" xmlns:r="http://schemas.openxmlformats.org/officeDocument/2006/relationships" xmlns:m="http://schemas.openxmlformats.org/officeDocument/2006/math" xmlns:v="urn:schemas-microsoft-com:vml" xmlns:wp14="http://schemas.microsoft.com/office/word/2010/wordprocessingDrawing" xmlns:wp="http://schemas.openxmlformats.org/drawingml/2006/wordprocessingDrawing" xmlns:w10="urn:schemas-microsoft-com:office:word" xmlns:w="http://schemas.openxmlformats.org/wordprocessingml/2006/main" xmlns:w14="http://schemas.microsoft.com/office/word/2010/wordml" xmlns:w15="http://schemas.microsoft.com/office/word/2012/wordml" xmlns:w16cex="http://schemas.microsoft.com/office/word/2018/wordml/cex" xmlns:w16cid="http://schemas.microsoft.com/office/word/2016/wordml/cid" xmlns:w16="http://schemas.microsoft.com/office/word/2018/wordml" xmlns:w16du="http://schemas.microsoft.com/office/word/2023/wordml/word16du" xmlns:w16sdtdh="http://schemas.microsoft.com/office/word/2020/wordml/sdtdatahash" xmlns:w16se="http://schemas.microsoft.com/office/word/2015/wordml/symex" xmlns:wpg="http://schemas.microsoft.com/office/word/2010/wordprocessingGroup" xmlns:wpi="http://schemas.microsoft.com/office/word/2010/wordprocessingInk" xmlns:wne="http://schemas.microsoft.com/office/word/2006/wordml" xmlns:wps="http://schemas.microsoft.com/office/word/2010/wordprocessingShape" mc:Ignorable="w14 w15 w16se w16cid w16 w16cex w16sdtdh w16du wp14">
+<w:endnotes xmlns:wpc="http://schemas.microsoft.com/office/word/2010/wordprocessingCanvas" xmlns:cx="http://schemas.microsoft.com/office/drawing/2014/chartex" xmlns:cx1="http://schemas.microsoft.com/office/drawing/2015/9/8/chartex" xmlns:cx2="http://schemas.microsoft.com/office/drawing/2015/10/21/chartex" xmlns:cx3="http://schemas.microsoft.com/office/drawing/2016/5/9/chartex" xmlns:cx4="http://schemas.microsoft.com/office/drawing/2016/5/10/chartex" xmlns:cx5="http://schemas.microsoft.com/office/drawing/2016/5/11/chartex" xmlns:cx6="http://schemas.microsoft.com/office/drawing/2016/5/12/chartex" xmlns:cx7="http://schemas.microsoft.com/office/drawing/2016/5/13/chartex" xmlns:cx8="http://schemas.microsoft.com/office/drawing/2016/5/14/chartex" xmlns:mc="http://schemas.openxmlformats.org/markup-compatibility/2006" xmlns:aink="http://schemas.microsoft.com/office/drawing/2016/ink" xmlns:am3d="http://schemas.microsoft.com/office/drawing/2017/model3d" xmlns:o="urn:schemas-microsoft-com:office:office" xmlns:oel="http://schemas.microsoft.com/office/2019/extlst" xmlns:r="http://schemas.openxmlformats.org/officeDocument/2006/relationships" xmlns:m="http://schemas.openxmlformats.org/officeDocument/2006/math" xmlns:v="urn:schemas-microsoft-com:vml" xmlns:wp14="http://schemas.microsoft.com/office/word/2010/wordprocessingDrawing" xmlns:wp="http://schemas.openxmlformats.org/drawingml/2006/wordprocessingDrawing" xmlns:w10="urn:schemas-microsoft-com:office:word" xmlns:w="http://schemas.openxmlformats.org/wordprocessingml/2006/main" xmlns:w14="http://schemas.microsoft.com/office/word/2010/wordml" xmlns:w15="http://schemas.microsoft.com/office/word/2012/wordml" xmlns:w16cex="http://schemas.microsoft.com/office/word/2018/wordml/cex" xmlns:w16cid="http://schemas.microsoft.com/office/word/2016/wordml/cid" xmlns:w16="http://schemas.microsoft.com/office/word/2018/wordml" xmlns:w16du="http://schemas.microsoft.com/office/word/2023/wordml/word16du" xmlns:w16sdtdh="http://schemas.microsoft.com/office/word/2020/wordml/sdtdatahash" xmlns:w16sdtfl="http://schemas.microsoft.com/office/word/2024/wordml/sdtformatlock" xmlns:w16se="http://schemas.microsoft.com/office/word/2015/wordml/symex" xmlns:wpg="http://schemas.microsoft.com/office/word/2010/wordprocessingGroup" xmlns:wpi="http://schemas.microsoft.com/office/word/2010/wordprocessingInk" xmlns:wne="http://schemas.microsoft.com/office/word/2006/wordml" xmlns:wps="http://schemas.microsoft.com/office/word/2010/wordprocessingShape" mc:Ignorable="w14 w15 w16se w16cid w16 w16cex w16sdtdh w16sdtfl w16du wp14">
   <w:endnote w:type="separator" w:id="-1">
     <w:p>
       <w:r>
@@ -8881,7 +9258,7 @@
 </file>
 
 <file path=word/footer1.xml><?xml version="1.0" encoding="utf-8"?>
-<w:ftr xmlns:wpc="http://schemas.microsoft.com/office/word/2010/wordprocessingCanvas" xmlns:cx="http://schemas.microsoft.com/office/drawing/2014/chartex" xmlns:cx1="http://schemas.microsoft.com/office/drawing/2015/9/8/chartex" xmlns:cx2="http://schemas.microsoft.com/office/drawing/2015/10/21/chartex" xmlns:cx3="http://schemas.microsoft.com/office/drawing/2016/5/9/chartex" xmlns:cx4="http://schemas.microsoft.com/office/drawing/2016/5/10/chartex" xmlns:cx5="http://schemas.microsoft.com/office/drawing/2016/5/11/chartex" xmlns:cx6="http://schemas.microsoft.com/office/drawing/2016/5/12/chartex" xmlns:cx7="http://schemas.microsoft.com/office/drawing/2016/5/13/chartex" xmlns:cx8="http://schemas.microsoft.com/office/drawing/2016/5/14/chartex" xmlns:mc="http://schemas.openxmlformats.org/markup-compatibility/2006" xmlns:aink="http://schemas.microsoft.com/office/drawing/2016/ink" xmlns:am3d="http://schemas.microsoft.com/office/drawing/2017/model3d" xmlns:o="urn:schemas-microsoft-com:office:office" xmlns:oel="http://schemas.microsoft.com/office/2019/extlst" xmlns:r="http://schemas.openxmlformats.org/officeDocument/2006/relationships" xmlns:m="http://schemas.openxmlformats.org/officeDocument/2006/math" xmlns:v="urn:schemas-microsoft-com:vml" xmlns:wp14="http://schemas.microsoft.com/office/word/2010/wordprocessingDrawing" xmlns:wp="http://schemas.openxmlformats.org/drawingml/2006/wordprocessingDrawing" xmlns:w10="urn:schemas-microsoft-com:office:word" xmlns:w="http://schemas.openxmlformats.org/wordprocessingml/2006/main" xmlns:w14="http://schemas.microsoft.com/office/word/2010/wordml" xmlns:w15="http://schemas.microsoft.com/office/word/2012/wordml" xmlns:w16cex="http://schemas.microsoft.com/office/word/2018/wordml/cex" xmlns:w16cid="http://schemas.microsoft.com/office/word/2016/wordml/cid" xmlns:w16="http://schemas.microsoft.com/office/word/2018/wordml" xmlns:w16du="http://schemas.microsoft.com/office/word/2023/wordml/word16du" xmlns:w16sdtdh="http://schemas.microsoft.com/office/word/2020/wordml/sdtdatahash" xmlns:w16se="http://schemas.microsoft.com/office/word/2015/wordml/symex" xmlns:wpg="http://schemas.microsoft.com/office/word/2010/wordprocessingGroup" xmlns:wpi="http://schemas.microsoft.com/office/word/2010/wordprocessingInk" xmlns:wne="http://schemas.microsoft.com/office/word/2006/wordml" xmlns:wps="http://schemas.microsoft.com/office/word/2010/wordprocessingShape" mc:Ignorable="w14 w15 w16se w16cid w16 w16cex w16sdtdh w16du wp14">
+<w:ftr xmlns:wpc="http://schemas.microsoft.com/office/word/2010/wordprocessingCanvas" xmlns:cx="http://schemas.microsoft.com/office/drawing/2014/chartex" xmlns:cx1="http://schemas.microsoft.com/office/drawing/2015/9/8/chartex" xmlns:cx2="http://schemas.microsoft.com/office/drawing/2015/10/21/chartex" xmlns:cx3="http://schemas.microsoft.com/office/drawing/2016/5/9/chartex" xmlns:cx4="http://schemas.microsoft.com/office/drawing/2016/5/10/chartex" xmlns:cx5="http://schemas.microsoft.com/office/drawing/2016/5/11/chartex" xmlns:cx6="http://schemas.microsoft.com/office/drawing/2016/5/12/chartex" xmlns:cx7="http://schemas.microsoft.com/office/drawing/2016/5/13/chartex" xmlns:cx8="http://schemas.microsoft.com/office/drawing/2016/5/14/chartex" xmlns:mc="http://schemas.openxmlformats.org/markup-compatibility/2006" xmlns:aink="http://schemas.microsoft.com/office/drawing/2016/ink" xmlns:am3d="http://schemas.microsoft.com/office/drawing/2017/model3d" xmlns:o="urn:schemas-microsoft-com:office:office" xmlns:oel="http://schemas.microsoft.com/office/2019/extlst" xmlns:r="http://schemas.openxmlformats.org/officeDocument/2006/relationships" xmlns:m="http://schemas.openxmlformats.org/officeDocument/2006/math" xmlns:v="urn:schemas-microsoft-com:vml" xmlns:wp14="http://schemas.microsoft.com/office/word/2010/wordprocessingDrawing" xmlns:wp="http://schemas.openxmlformats.org/drawingml/2006/wordprocessingDrawing" xmlns:w10="urn:schemas-microsoft-com:office:word" xmlns:w="http://schemas.openxmlformats.org/wordprocessingml/2006/main" xmlns:w14="http://schemas.microsoft.com/office/word/2010/wordml" xmlns:w15="http://schemas.microsoft.com/office/word/2012/wordml" xmlns:w16cex="http://schemas.microsoft.com/office/word/2018/wordml/cex" xmlns:w16cid="http://schemas.microsoft.com/office/word/2016/wordml/cid" xmlns:w16="http://schemas.microsoft.com/office/word/2018/wordml" xmlns:w16du="http://schemas.microsoft.com/office/word/2023/wordml/word16du" xmlns:w16sdtdh="http://schemas.microsoft.com/office/word/2020/wordml/sdtdatahash" xmlns:w16sdtfl="http://schemas.microsoft.com/office/word/2024/wordml/sdtformatlock" xmlns:w16se="http://schemas.microsoft.com/office/word/2015/wordml/symex" xmlns:wpg="http://schemas.microsoft.com/office/word/2010/wordprocessingGroup" xmlns:wpi="http://schemas.microsoft.com/office/word/2010/wordprocessingInk" xmlns:wne="http://schemas.microsoft.com/office/word/2006/wordml" xmlns:wps="http://schemas.microsoft.com/office/word/2010/wordprocessingShape" mc:Ignorable="w14 w15 w16se w16cid w16 w16cex w16sdtdh w16sdtfl w16du wp14">
   <w:p>
     <w:pPr>
       <w:spacing w:before="60"/>
@@ -8990,7 +9367,7 @@
 </file>
 
 <file path=word/footnotes.xml><?xml version="1.0" encoding="utf-8"?>
-<w:footnotes xmlns:wpc="http://schemas.microsoft.com/office/word/2010/wordprocessingCanvas" xmlns:cx="http://schemas.microsoft.com/office/drawing/2014/chartex" xmlns:cx1="http://schemas.microsoft.com/office/drawing/2015/9/8/chartex" xmlns:cx2="http://schemas.microsoft.com/office/drawing/2015/10/21/chartex" xmlns:cx3="http://schemas.microsoft.com/office/drawing/2016/5/9/chartex" xmlns:cx4="http://schemas.microsoft.com/office/drawing/2016/5/10/chartex" xmlns:cx5="http://schemas.microsoft.com/office/drawing/2016/5/11/chartex" xmlns:cx6="http://schemas.microsoft.com/office/drawing/2016/5/12/chartex" xmlns:cx7="http://schemas.microsoft.com/office/drawing/2016/5/13/chartex" xmlns:cx8="http://schemas.microsoft.com/office/drawing/2016/5/14/chartex" xmlns:mc="http://schemas.openxmlformats.org/markup-compatibility/2006" xmlns:aink="http://schemas.microsoft.com/office/drawing/2016/ink" xmlns:am3d="http://schemas.microsoft.com/office/drawing/2017/model3d" xmlns:o="urn:schemas-microsoft-com:office:office" xmlns:oel="http://schemas.microsoft.com/office/2019/extlst" xmlns:r="http://schemas.openxmlformats.org/officeDocument/2006/relationships" xmlns:m="http://schemas.openxmlformats.org/officeDocument/2006/math" xmlns:v="urn:schemas-microsoft-com:vml" xmlns:wp14="http://schemas.microsoft.com/office/word/2010/wordprocessingDrawing" xmlns:wp="http://schemas.openxmlformats.org/drawingml/2006/wordprocessingDrawing" xmlns:w10="urn:schemas-microsoft-com:office:word" xmlns:w="http://schemas.openxmlformats.org/wordprocessingml/2006/main" xmlns:w14="http://schemas.microsoft.com/office/word/2010/wordml" xmlns:w15="http://schemas.microsoft.com/office/word/2012/wordml" xmlns:w16cex="http://schemas.microsoft.com/office/word/2018/wordml/cex" xmlns:w16cid="http://schemas.microsoft.com/office/word/2016/wordml/cid" xmlns:w16="http://schemas.microsoft.com/office/word/2018/wordml" xmlns:w16du="http://schemas.microsoft.com/office/word/2023/wordml/word16du" xmlns:w16sdtdh="http://schemas.microsoft.com/office/word/2020/wordml/sdtdatahash" xmlns:w16se="http://schemas.microsoft.com/office/word/2015/wordml/symex" xmlns:wpg="http://schemas.microsoft.com/office/word/2010/wordprocessingGroup" xmlns:wpi="http://schemas.microsoft.com/office/word/2010/wordprocessingInk" xmlns:wne="http://schemas.microsoft.com/office/word/2006/wordml" xmlns:wps="http://schemas.microsoft.com/office/word/2010/wordprocessingShape" mc:Ignorable="w14 w15 w16se w16cid w16 w16cex w16sdtdh w16du wp14">
+<w:footnotes xmlns:wpc="http://schemas.microsoft.com/office/word/2010/wordprocessingCanvas" xmlns:cx="http://schemas.microsoft.com/office/drawing/2014/chartex" xmlns:cx1="http://schemas.microsoft.com/office/drawing/2015/9/8/chartex" xmlns:cx2="http://schemas.microsoft.com/office/drawing/2015/10/21/chartex" xmlns:cx3="http://schemas.microsoft.com/office/drawing/2016/5/9/chartex" xmlns:cx4="http://schemas.microsoft.com/office/drawing/2016/5/10/chartex" xmlns:cx5="http://schemas.microsoft.com/office/drawing/2016/5/11/chartex" xmlns:cx6="http://schemas.microsoft.com/office/drawing/2016/5/12/chartex" xmlns:cx7="http://schemas.microsoft.com/office/drawing/2016/5/13/chartex" xmlns:cx8="http://schemas.microsoft.com/office/drawing/2016/5/14/chartex" xmlns:mc="http://schemas.openxmlformats.org/markup-compatibility/2006" xmlns:aink="http://schemas.microsoft.com/office/drawing/2016/ink" xmlns:am3d="http://schemas.microsoft.com/office/drawing/2017/model3d" xmlns:o="urn:schemas-microsoft-com:office:office" xmlns:oel="http://schemas.microsoft.com/office/2019/extlst" xmlns:r="http://schemas.openxmlformats.org/officeDocument/2006/relationships" xmlns:m="http://schemas.openxmlformats.org/officeDocument/2006/math" xmlns:v="urn:schemas-microsoft-com:vml" xmlns:wp14="http://schemas.microsoft.com/office/word/2010/wordprocessingDrawing" xmlns:wp="http://schemas.openxmlformats.org/drawingml/2006/wordprocessingDrawing" xmlns:w10="urn:schemas-microsoft-com:office:word" xmlns:w="http://schemas.openxmlformats.org/wordprocessingml/2006/main" xmlns:w14="http://schemas.microsoft.com/office/word/2010/wordml" xmlns:w15="http://schemas.microsoft.com/office/word/2012/wordml" xmlns:w16cex="http://schemas.microsoft.com/office/word/2018/wordml/cex" xmlns:w16cid="http://schemas.microsoft.com/office/word/2016/wordml/cid" xmlns:w16="http://schemas.microsoft.com/office/word/2018/wordml" xmlns:w16du="http://schemas.microsoft.com/office/word/2023/wordml/word16du" xmlns:w16sdtdh="http://schemas.microsoft.com/office/word/2020/wordml/sdtdatahash" xmlns:w16sdtfl="http://schemas.microsoft.com/office/word/2024/wordml/sdtformatlock" xmlns:w16se="http://schemas.microsoft.com/office/word/2015/wordml/symex" xmlns:wpg="http://schemas.microsoft.com/office/word/2010/wordprocessingGroup" xmlns:wpi="http://schemas.microsoft.com/office/word/2010/wordprocessingInk" xmlns:wne="http://schemas.microsoft.com/office/word/2006/wordml" xmlns:wps="http://schemas.microsoft.com/office/word/2010/wordprocessingShape" mc:Ignorable="w14 w15 w16se w16cid w16 w16cex w16sdtdh w16sdtfl w16du wp14">
   <w:footnote w:type="separator" w:id="-1">
     <w:p>
       <w:r>
@@ -9009,7 +9386,7 @@
 </file>
 
 <file path=word/header1.xml><?xml version="1.0" encoding="utf-8"?>
-<w:hdr xmlns:wpc="http://schemas.microsoft.com/office/word/2010/wordprocessingCanvas" xmlns:cx="http://schemas.microsoft.com/office/drawing/2014/chartex" xmlns:cx1="http://schemas.microsoft.com/office/drawing/2015/9/8/chartex" xmlns:cx2="http://schemas.microsoft.com/office/drawing/2015/10/21/chartex" xmlns:cx3="http://schemas.microsoft.com/office/drawing/2016/5/9/chartex" xmlns:cx4="http://schemas.microsoft.com/office/drawing/2016/5/10/chartex" xmlns:cx5="http://schemas.microsoft.com/office/drawing/2016/5/11/chartex" xmlns:cx6="http://schemas.microsoft.com/office/drawing/2016/5/12/chartex" xmlns:cx7="http://schemas.microsoft.com/office/drawing/2016/5/13/chartex" xmlns:cx8="http://schemas.microsoft.com/office/drawing/2016/5/14/chartex" xmlns:mc="http://schemas.openxmlformats.org/markup-compatibility/2006" xmlns:aink="http://schemas.microsoft.com/office/drawing/2016/ink" xmlns:am3d="http://schemas.microsoft.com/office/drawing/2017/model3d" xmlns:o="urn:schemas-microsoft-com:office:office" xmlns:oel="http://schemas.microsoft.com/office/2019/extlst" xmlns:r="http://schemas.openxmlformats.org/officeDocument/2006/relationships" xmlns:m="http://schemas.openxmlformats.org/officeDocument/2006/math" xmlns:v="urn:schemas-microsoft-com:vml" xmlns:wp14="http://schemas.microsoft.com/office/word/2010/wordprocessingDrawing" xmlns:wp="http://schemas.openxmlformats.org/drawingml/2006/wordprocessingDrawing" xmlns:w10="urn:schemas-microsoft-com:office:word" xmlns:w="http://schemas.openxmlformats.org/wordprocessingml/2006/main" xmlns:w14="http://schemas.microsoft.com/office/word/2010/wordml" xmlns:w15="http://schemas.microsoft.com/office/word/2012/wordml" xmlns:w16cex="http://schemas.microsoft.com/office/word/2018/wordml/cex" xmlns:w16cid="http://schemas.microsoft.com/office/word/2016/wordml/cid" xmlns:w16="http://schemas.microsoft.com/office/word/2018/wordml" xmlns:w16du="http://schemas.microsoft.com/office/word/2023/wordml/word16du" xmlns:w16sdtdh="http://schemas.microsoft.com/office/word/2020/wordml/sdtdatahash" xmlns:w16se="http://schemas.microsoft.com/office/word/2015/wordml/symex" xmlns:wpg="http://schemas.microsoft.com/office/word/2010/wordprocessingGroup" xmlns:wpi="http://schemas.microsoft.com/office/word/2010/wordprocessingInk" xmlns:wne="http://schemas.microsoft.com/office/word/2006/wordml" xmlns:wps="http://schemas.microsoft.com/office/word/2010/wordprocessingShape" mc:Ignorable="w14 w15 w16se w16cid w16 w16cex w16sdtdh w16du wp14">
+<w:hdr xmlns:wpc="http://schemas.microsoft.com/office/word/2010/wordprocessingCanvas" xmlns:cx="http://schemas.microsoft.com/office/drawing/2014/chartex" xmlns:cx1="http://schemas.microsoft.com/office/drawing/2015/9/8/chartex" xmlns:cx2="http://schemas.microsoft.com/office/drawing/2015/10/21/chartex" xmlns:cx3="http://schemas.microsoft.com/office/drawing/2016/5/9/chartex" xmlns:cx4="http://schemas.microsoft.com/office/drawing/2016/5/10/chartex" xmlns:cx5="http://schemas.microsoft.com/office/drawing/2016/5/11/chartex" xmlns:cx6="http://schemas.microsoft.com/office/drawing/2016/5/12/chartex" xmlns:cx7="http://schemas.microsoft.com/office/drawing/2016/5/13/chartex" xmlns:cx8="http://schemas.microsoft.com/office/drawing/2016/5/14/chartex" xmlns:mc="http://schemas.openxmlformats.org/markup-compatibility/2006" xmlns:aink="http://schemas.microsoft.com/office/drawing/2016/ink" xmlns:am3d="http://schemas.microsoft.com/office/drawing/2017/model3d" xmlns:o="urn:schemas-microsoft-com:office:office" xmlns:oel="http://schemas.microsoft.com/office/2019/extlst" xmlns:r="http://schemas.openxmlformats.org/officeDocument/2006/relationships" xmlns:m="http://schemas.openxmlformats.org/officeDocument/2006/math" xmlns:v="urn:schemas-microsoft-com:vml" xmlns:wp14="http://schemas.microsoft.com/office/word/2010/wordprocessingDrawing" xmlns:wp="http://schemas.openxmlformats.org/drawingml/2006/wordprocessingDrawing" xmlns:w10="urn:schemas-microsoft-com:office:word" xmlns:w="http://schemas.openxmlformats.org/wordprocessingml/2006/main" xmlns:w14="http://schemas.microsoft.com/office/word/2010/wordml" xmlns:w15="http://schemas.microsoft.com/office/word/2012/wordml" xmlns:w16cex="http://schemas.microsoft.com/office/word/2018/wordml/cex" xmlns:w16cid="http://schemas.microsoft.com/office/word/2016/wordml/cid" xmlns:w16="http://schemas.microsoft.com/office/word/2018/wordml" xmlns:w16du="http://schemas.microsoft.com/office/word/2023/wordml/word16du" xmlns:w16sdtdh="http://schemas.microsoft.com/office/word/2020/wordml/sdtdatahash" xmlns:w16sdtfl="http://schemas.microsoft.com/office/word/2024/wordml/sdtformatlock" xmlns:w16se="http://schemas.microsoft.com/office/word/2015/wordml/symex" xmlns:wpg="http://schemas.microsoft.com/office/word/2010/wordprocessingGroup" xmlns:wpi="http://schemas.microsoft.com/office/word/2010/wordprocessingInk" xmlns:wne="http://schemas.microsoft.com/office/word/2006/wordml" xmlns:wps="http://schemas.microsoft.com/office/word/2010/wordprocessingShape" mc:Ignorable="w14 w15 w16se w16cid w16 w16cex w16sdtdh w16sdtfl w16du wp14">
   <w:p>
     <w:pPr>
       <w:pBdr>
@@ -9030,7 +9407,7 @@
 </file>
 
 <file path=word/numbering.xml><?xml version="1.0" encoding="utf-8"?>
-<w:numbering xmlns:wpc="http://schemas.microsoft.com/office/word/2010/wordprocessingCanvas" xmlns:cx="http://schemas.microsoft.com/office/drawing/2014/chartex" xmlns:cx1="http://schemas.microsoft.com/office/drawing/2015/9/8/chartex" xmlns:cx2="http://schemas.microsoft.com/office/drawing/2015/10/21/chartex" xmlns:cx3="http://schemas.microsoft.com/office/drawing/2016/5/9/chartex" xmlns:cx4="http://schemas.microsoft.com/office/drawing/2016/5/10/chartex" xmlns:cx5="http://schemas.microsoft.com/office/drawing/2016/5/11/chartex" xmlns:cx6="http://schemas.microsoft.com/office/drawing/2016/5/12/chartex" xmlns:cx7="http://schemas.microsoft.com/office/drawing/2016/5/13/chartex" xmlns:cx8="http://schemas.microsoft.com/office/drawing/2016/5/14/chartex" xmlns:mc="http://schemas.openxmlformats.org/markup-compatibility/2006" xmlns:aink="http://schemas.microsoft.com/office/drawing/2016/ink" xmlns:am3d="http://schemas.microsoft.com/office/drawing/2017/model3d" xmlns:o="urn:schemas-microsoft-com:office:office" xmlns:oel="http://schemas.microsoft.com/office/2019/extlst" xmlns:r="http://schemas.openxmlformats.org/officeDocument/2006/relationships" xmlns:m="http://schemas.openxmlformats.org/officeDocument/2006/math" xmlns:v="urn:schemas-microsoft-com:vml" xmlns:wp14="http://schemas.microsoft.com/office/word/2010/wordprocessingDrawing" xmlns:wp="http://schemas.openxmlformats.org/drawingml/2006/wordprocessingDrawing" xmlns:w10="urn:schemas-microsoft-com:office:word" xmlns:w="http://schemas.openxmlformats.org/wordprocessingml/2006/main" xmlns:w14="http://schemas.microsoft.com/office/word/2010/wordml" xmlns:w15="http://schemas.microsoft.com/office/word/2012/wordml" xmlns:w16cex="http://schemas.microsoft.com/office/word/2018/wordml/cex" xmlns:w16cid="http://schemas.microsoft.com/office/word/2016/wordml/cid" xmlns:w16="http://schemas.microsoft.com/office/word/2018/wordml" xmlns:w16du="http://schemas.microsoft.com/office/word/2023/wordml/word16du" xmlns:w16sdtdh="http://schemas.microsoft.com/office/word/2020/wordml/sdtdatahash" xmlns:w16se="http://schemas.microsoft.com/office/word/2015/wordml/symex" xmlns:wpg="http://schemas.microsoft.com/office/word/2010/wordprocessingGroup" xmlns:wpi="http://schemas.microsoft.com/office/word/2010/wordprocessingInk" xmlns:wne="http://schemas.microsoft.com/office/word/2006/wordml" xmlns:wps="http://schemas.microsoft.com/office/word/2010/wordprocessingShape" mc:Ignorable="w14 w15 w16se w16cid w16 w16cex w16sdtdh w16du wp14">
+<w:numbering xmlns:wpc="http://schemas.microsoft.com/office/word/2010/wordprocessingCanvas" xmlns:cx="http://schemas.microsoft.com/office/drawing/2014/chartex" xmlns:cx1="http://schemas.microsoft.com/office/drawing/2015/9/8/chartex" xmlns:cx2="http://schemas.microsoft.com/office/drawing/2015/10/21/chartex" xmlns:cx3="http://schemas.microsoft.com/office/drawing/2016/5/9/chartex" xmlns:cx4="http://schemas.microsoft.com/office/drawing/2016/5/10/chartex" xmlns:cx5="http://schemas.microsoft.com/office/drawing/2016/5/11/chartex" xmlns:cx6="http://schemas.microsoft.com/office/drawing/2016/5/12/chartex" xmlns:cx7="http://schemas.microsoft.com/office/drawing/2016/5/13/chartex" xmlns:cx8="http://schemas.microsoft.com/office/drawing/2016/5/14/chartex" xmlns:mc="http://schemas.openxmlformats.org/markup-compatibility/2006" xmlns:aink="http://schemas.microsoft.com/office/drawing/2016/ink" xmlns:am3d="http://schemas.microsoft.com/office/drawing/2017/model3d" xmlns:o="urn:schemas-microsoft-com:office:office" xmlns:oel="http://schemas.microsoft.com/office/2019/extlst" xmlns:r="http://schemas.openxmlformats.org/officeDocument/2006/relationships" xmlns:m="http://schemas.openxmlformats.org/officeDocument/2006/math" xmlns:v="urn:schemas-microsoft-com:vml" xmlns:wp14="http://schemas.microsoft.com/office/word/2010/wordprocessingDrawing" xmlns:wp="http://schemas.openxmlformats.org/drawingml/2006/wordprocessingDrawing" xmlns:w10="urn:schemas-microsoft-com:office:word" xmlns:w="http://schemas.openxmlformats.org/wordprocessingml/2006/main" xmlns:w14="http://schemas.microsoft.com/office/word/2010/wordml" xmlns:w15="http://schemas.microsoft.com/office/word/2012/wordml" xmlns:w16cex="http://schemas.microsoft.com/office/word/2018/wordml/cex" xmlns:w16cid="http://schemas.microsoft.com/office/word/2016/wordml/cid" xmlns:w16="http://schemas.microsoft.com/office/word/2018/wordml" xmlns:w16du="http://schemas.microsoft.com/office/word/2023/wordml/word16du" xmlns:w16sdtdh="http://schemas.microsoft.com/office/word/2020/wordml/sdtdatahash" xmlns:w16sdtfl="http://schemas.microsoft.com/office/word/2024/wordml/sdtformatlock" xmlns:w16se="http://schemas.microsoft.com/office/word/2015/wordml/symex" xmlns:wpg="http://schemas.microsoft.com/office/word/2010/wordprocessingGroup" xmlns:wpi="http://schemas.microsoft.com/office/word/2010/wordprocessingInk" xmlns:wne="http://schemas.microsoft.com/office/word/2006/wordml" xmlns:wps="http://schemas.microsoft.com/office/word/2010/wordprocessingShape" mc:Ignorable="w14 w15 w16se w16cid w16 w16cex w16sdtdh w16sdtfl w16du wp14">
   <w:abstractNum w:abstractNumId="0" w15:restartNumberingAfterBreak="0">
     <w:nsid w:val="0E464751"/>
     <w:multiLevelType w:val="hybridMultilevel"/>
@@ -9127,14 +9504,14 @@
 </file>
 
 <file path=word/styles.xml><?xml version="1.0" encoding="utf-8"?>
-<w:styles xmlns:mc="http://schemas.openxmlformats.org/markup-compatibility/2006" xmlns:r="http://schemas.openxmlformats.org/officeDocument/2006/relationships" xmlns:w="http://schemas.openxmlformats.org/wordprocessingml/2006/main" xmlns:w14="http://schemas.microsoft.com/office/word/2010/wordml" xmlns:w15="http://schemas.microsoft.com/office/word/2012/wordml" xmlns:w16cex="http://schemas.microsoft.com/office/word/2018/wordml/cex" xmlns:w16cid="http://schemas.microsoft.com/office/word/2016/wordml/cid" xmlns:w16="http://schemas.microsoft.com/office/word/2018/wordml" xmlns:w16du="http://schemas.microsoft.com/office/word/2023/wordml/word16du" xmlns:w16sdtdh="http://schemas.microsoft.com/office/word/2020/wordml/sdtdatahash" xmlns:w16se="http://schemas.microsoft.com/office/word/2015/wordml/symex" mc:Ignorable="w14 w15 w16se w16cid w16 w16cex w16sdtdh w16du">
+<w:styles xmlns:mc="http://schemas.openxmlformats.org/markup-compatibility/2006" xmlns:r="http://schemas.openxmlformats.org/officeDocument/2006/relationships" xmlns:w="http://schemas.openxmlformats.org/wordprocessingml/2006/main" xmlns:w14="http://schemas.microsoft.com/office/word/2010/wordml" xmlns:w15="http://schemas.microsoft.com/office/word/2012/wordml" xmlns:w16cex="http://schemas.microsoft.com/office/word/2018/wordml/cex" xmlns:w16cid="http://schemas.microsoft.com/office/word/2016/wordml/cid" xmlns:w16="http://schemas.microsoft.com/office/word/2018/wordml" xmlns:w16du="http://schemas.microsoft.com/office/word/2023/wordml/word16du" xmlns:w16sdtdh="http://schemas.microsoft.com/office/word/2020/wordml/sdtdatahash" xmlns:w16sdtfl="http://schemas.microsoft.com/office/word/2024/wordml/sdtformatlock" xmlns:w16se="http://schemas.microsoft.com/office/word/2015/wordml/symex" mc:Ignorable="w14 w15 w16se w16cid w16 w16cex w16sdtdh w16sdtfl w16du">
   <w:docDefaults>
     <w:rPrDefault>
       <w:rPr>
         <w:rFonts w:ascii="Calibri" w:eastAsia="Calibri" w:hAnsi="Calibri" w:cs="Calibri"/>
         <w:sz w:val="21"/>
         <w:szCs w:val="21"/>
-        <w:lang w:eastAsia="en-US" w:bidi="ar-SA"/>
+        <w:lang w:val="en-US" w:eastAsia="en-US" w:bidi="ar-SA"/>
       </w:rPr>
     </w:rPrDefault>
     <w:pPrDefault/>
@@ -9608,7 +9985,6 @@
   <w:style w:type="character" w:default="1" w:styleId="DefaultParagraphFont">
     <w:name w:val="Default Paragraph Font"/>
     <w:uiPriority w:val="1"/>
-    <w:semiHidden/>
     <w:unhideWhenUsed/>
   </w:style>
   <w:style w:type="table" w:default="1" w:styleId="TableNormal">
@@ -9722,6 +10098,21 @@
     <w:rPr>
       <w:sz w:val="20"/>
       <w:szCs w:val="20"/>
+    </w:rPr>
+  </w:style>
+  <w:style w:type="paragraph" w:styleId="NormalWeb">
+    <w:name w:val="Normal (Web)"/>
+    <w:basedOn w:val="Normal"/>
+    <w:uiPriority w:val="99"/>
+    <w:unhideWhenUsed/>
+    <w:rsid w:val="00EB6D4C"/>
+    <w:pPr>
+      <w:spacing w:before="100" w:beforeAutospacing="1" w:after="100" w:afterAutospacing="1"/>
+    </w:pPr>
+    <w:rPr>
+      <w:rFonts w:ascii="Times New Roman" w:eastAsia="Times New Roman" w:hAnsi="Times New Roman" w:cs="Times New Roman"/>
+      <w:sz w:val="24"/>
+      <w:szCs w:val="24"/>
     </w:rPr>
   </w:style>
 </w:styles>

</xml_diff>

<commit_message>
Update P1 template with Manideep's sections
Co-Authored-By: Claude Opus 5.5 <noreply@anthropic.com>
</commit_message>
<xml_diff>
--- a/CS3354_F2026_P1_Template.docx
+++ b/CS3354_F2026_P1_Template.docx
@@ -1,6 +1,6 @@
 
 <file path=word/document.xml><?xml version="1.0" encoding="utf-8"?>
-<w:document xmlns:wpc="http://schemas.microsoft.com/office/word/2010/wordprocessingCanvas" xmlns:cx="http://schemas.microsoft.com/office/drawing/2014/chartex" xmlns:cx1="http://schemas.microsoft.com/office/drawing/2015/9/8/chartex" xmlns:cx2="http://schemas.microsoft.com/office/drawing/2015/10/21/chartex" xmlns:cx3="http://schemas.microsoft.com/office/drawing/2016/5/9/chartex" xmlns:cx4="http://schemas.microsoft.com/office/drawing/2016/5/10/chartex" xmlns:cx5="http://schemas.microsoft.com/office/drawing/2016/5/11/chartex" xmlns:cx6="http://schemas.microsoft.com/office/drawing/2016/5/12/chartex" xmlns:cx7="http://schemas.microsoft.com/office/drawing/2016/5/13/chartex" xmlns:cx8="http://schemas.microsoft.com/office/drawing/2016/5/14/chartex" xmlns:mc="http://schemas.openxmlformats.org/markup-compatibility/2006" xmlns:aink="http://schemas.microsoft.com/office/drawing/2016/ink" xmlns:am3d="http://schemas.microsoft.com/office/drawing/2017/model3d" xmlns:o="urn:schemas-microsoft-com:office:office" xmlns:oel="http://schemas.microsoft.com/office/2019/extlst" xmlns:r="http://schemas.openxmlformats.org/officeDocument/2006/relationships" xmlns:m="http://schemas.openxmlformats.org/officeDocument/2006/math" xmlns:v="urn:schemas-microsoft-com:vml" xmlns:wp14="http://schemas.microsoft.com/office/word/2010/wordprocessingDrawing" xmlns:wp="http://schemas.openxmlformats.org/drawingml/2006/wordprocessingDrawing" xmlns:w10="urn:schemas-microsoft-com:office:word" xmlns:w="http://schemas.openxmlformats.org/wordprocessingml/2006/main" xmlns:w14="http://schemas.microsoft.com/office/word/2010/wordml" xmlns:w15="http://schemas.microsoft.com/office/word/2012/wordml" xmlns:w16cex="http://schemas.microsoft.com/office/word/2018/wordml/cex" xmlns:w16cid="http://schemas.microsoft.com/office/word/2016/wordml/cid" xmlns:w16="http://schemas.microsoft.com/office/word/2018/wordml" xmlns:w16du="http://schemas.microsoft.com/office/word/2023/wordml/word16du" xmlns:w16sdtdh="http://schemas.microsoft.com/office/word/2020/wordml/sdtdatahash" xmlns:w16se="http://schemas.microsoft.com/office/word/2015/wordml/symex" xmlns:wpg="http://schemas.microsoft.com/office/word/2010/wordprocessingGroup" xmlns:wpi="http://schemas.microsoft.com/office/word/2010/wordprocessingInk" xmlns:wne="http://schemas.microsoft.com/office/word/2006/wordml" xmlns:wps="http://schemas.microsoft.com/office/word/2010/wordprocessingShape" mc:Ignorable="w14 w15 w16se w16cid w16 w16cex w16sdtdh w16du wp14">
+<w:document xmlns:wpc="http://schemas.microsoft.com/office/word/2010/wordprocessingCanvas" xmlns:cx="http://schemas.microsoft.com/office/drawing/2014/chartex" xmlns:cx1="http://schemas.microsoft.com/office/drawing/2015/9/8/chartex" xmlns:cx2="http://schemas.microsoft.com/office/drawing/2015/10/21/chartex" xmlns:cx3="http://schemas.microsoft.com/office/drawing/2016/5/9/chartex" xmlns:cx4="http://schemas.microsoft.com/office/drawing/2016/5/10/chartex" xmlns:cx5="http://schemas.microsoft.com/office/drawing/2016/5/11/chartex" xmlns:cx6="http://schemas.microsoft.com/office/drawing/2016/5/12/chartex" xmlns:cx7="http://schemas.microsoft.com/office/drawing/2016/5/13/chartex" xmlns:cx8="http://schemas.microsoft.com/office/drawing/2016/5/14/chartex" xmlns:mc="http://schemas.openxmlformats.org/markup-compatibility/2006" xmlns:m="http://schemas.openxmlformats.org/officeDocument/2006/math" xmlns:aink="http://schemas.microsoft.com/office/drawing/2016/ink" xmlns:am3d="http://schemas.microsoft.com/office/drawing/2017/model3d" xmlns:oel="http://schemas.microsoft.com/office/2019/extlst" xmlns:r="http://schemas.openxmlformats.org/officeDocument/2006/relationships" xmlns:wp14="http://schemas.microsoft.com/office/word/2010/wordprocessingDrawing" xmlns:wp="http://schemas.openxmlformats.org/drawingml/2006/wordprocessingDrawing" xmlns:wpg="http://schemas.microsoft.com/office/word/2010/wordprocessingGroup" xmlns:wpi="http://schemas.microsoft.com/office/word/2010/wordprocessingInk" xmlns:wps="http://schemas.microsoft.com/office/word/2010/wordprocessingShape" xmlns:o="urn:schemas-microsoft-com:office:office" xmlns:v="urn:schemas-microsoft-com:vml" xmlns:w10="urn:schemas-microsoft-com:office:word" xmlns:w="http://schemas.openxmlformats.org/wordprocessingml/2006/main" xmlns:w14="http://schemas.microsoft.com/office/word/2010/wordml" xmlns:w15="http://schemas.microsoft.com/office/word/2012/wordml" xmlns:w16cex="http://schemas.microsoft.com/office/word/2018/wordml/cex" xmlns:w16cid="http://schemas.microsoft.com/office/word/2016/wordml/cid" xmlns:w16="http://schemas.microsoft.com/office/word/2018/wordml" xmlns:w16sdtdh="http://schemas.microsoft.com/office/word/2020/wordml/sdtdatahash" xmlns:w16sdtfl="http://schemas.microsoft.com/office/word/2024/wordml/sdtformatlock" xmlns:w16se="http://schemas.microsoft.com/office/word/2015/wordml/symex" xmlns:w16du="http://schemas.microsoft.com/office/word/2023/wordml/word16du" xmlns:wne="http://schemas.microsoft.com/office/word/2006/wordml" mc:Ignorable="w14 w15 w16se w16cid w16 w16cex w16sdtdh w16sdtfl w16du wp14">
   <w:body>
     <w:p>
       <w:pPr>
@@ -38,9 +38,6 @@
     <w:p>
       <w:pPr>
         <w:spacing w:after="120" w:line="260" w:lineRule="auto"/>
-        <w:rPr>
-          <w:lang w:val="en-US"/>
-        </w:rPr>
       </w:pPr>
       <w:r>
         <w:rPr>
@@ -237,7 +234,11 @@
               <w:right w:w="100" w:type="dxa"/>
             </w:tcMar>
           </w:tcPr>
-          <w:p/>
+          <w:p>
+            <w:r>
+              <w:t>Manideep Pendyala – mcp230000</w:t>
+            </w:r>
+          </w:p>
         </w:tc>
       </w:tr>
       <w:tr>
@@ -7637,7 +7638,17 @@
               <w:right w:w="100" w:type="dxa"/>
             </w:tcMar>
           </w:tcPr>
-          <w:p/>
+          <w:p>
+            <w:r>
+              <w:t xml:space="preserve">Does "prototype evidence" require a working prototype, or </w:t>
+            </w:r>
+            <w:r>
+              <w:t xml:space="preserve">wireframes </w:t>
+            </w:r>
+            <w:r>
+              <w:t>and walkthrough feedback enough?</w:t>
+            </w:r>
+          </w:p>
         </w:tc>
         <w:tc>
           <w:tcPr>
@@ -7649,7 +7660,11 @@
               <w:right w:w="100" w:type="dxa"/>
             </w:tcMar>
           </w:tcPr>
-          <w:p/>
+          <w:p>
+            <w:r>
+              <w:t>Instructor and Project Lead</w:t>
+            </w:r>
+          </w:p>
         </w:tc>
         <w:tc>
           <w:tcPr>
@@ -7661,7 +7676,11 @@
               <w:right w:w="100" w:type="dxa"/>
             </w:tcMar>
           </w:tcPr>
-          <w:p/>
+          <w:p>
+            <w:r>
+              <w:t>Fri 10/23</w:t>
+            </w:r>
+          </w:p>
         </w:tc>
         <w:tc>
           <w:tcPr>
@@ -7673,7 +7692,11 @@
               <w:right w:w="100" w:type="dxa"/>
             </w:tcMar>
           </w:tcPr>
-          <w:p/>
+          <w:p>
+            <w:r>
+              <w:t>Sketches and walkthrough feedback only, not an MVP</w:t>
+            </w:r>
+          </w:p>
         </w:tc>
       </w:tr>
       <w:tr>
@@ -7708,7 +7731,11 @@
               <w:right w:w="100" w:type="dxa"/>
             </w:tcMar>
           </w:tcPr>
-          <w:p/>
+          <w:p>
+            <w:r>
+              <w:t xml:space="preserve">Will the system need real user accounts or temporary “guest” accounts to save space and have better simplicity. </w:t>
+            </w:r>
+          </w:p>
         </w:tc>
         <w:tc>
           <w:tcPr>
@@ -7720,7 +7747,11 @@
               <w:right w:w="100" w:type="dxa"/>
             </w:tcMar>
           </w:tcPr>
-          <w:p/>
+          <w:p>
+            <w:r>
+              <w:t>Project Lead and analysts</w:t>
+            </w:r>
+          </w:p>
         </w:tc>
         <w:tc>
           <w:tcPr>
@@ -7732,7 +7763,11 @@
               <w:right w:w="100" w:type="dxa"/>
             </w:tcMar>
           </w:tcPr>
-          <w:p/>
+          <w:p>
+            <w:r>
+              <w:t>Fri 10/23</w:t>
+            </w:r>
+          </w:p>
         </w:tc>
         <w:tc>
           <w:tcPr>
@@ -7744,7 +7779,11 @@
               <w:right w:w="100" w:type="dxa"/>
             </w:tcMar>
           </w:tcPr>
-          <w:p/>
+          <w:p>
+            <w:r>
+              <w:t xml:space="preserve">No email accounts are needed for customers, instead could be fulfilled with </w:t>
+            </w:r>
+          </w:p>
         </w:tc>
       </w:tr>
       <w:tr>
@@ -7765,6 +7804,7 @@
                 <w:sz w:val="18"/>
                 <w:szCs w:val="18"/>
               </w:rPr>
+              <w:lastRenderedPageBreak/>
               <w:t>Q3</w:t>
             </w:r>
           </w:p>
@@ -7779,7 +7819,11 @@
               <w:right w:w="100" w:type="dxa"/>
             </w:tcMar>
           </w:tcPr>
-          <w:p/>
+          <w:p>
+            <w:r>
+              <w:t>What languages, technologies, and frameworks are needed to complete the project.</w:t>
+            </w:r>
+          </w:p>
         </w:tc>
         <w:tc>
           <w:tcPr>
@@ -7791,7 +7835,11 @@
               <w:right w:w="100" w:type="dxa"/>
             </w:tcMar>
           </w:tcPr>
-          <w:p/>
+          <w:p>
+            <w:r>
+              <w:t>Architect</w:t>
+            </w:r>
+          </w:p>
         </w:tc>
         <w:tc>
           <w:tcPr>
@@ -7803,7 +7851,11 @@
               <w:right w:w="100" w:type="dxa"/>
             </w:tcMar>
           </w:tcPr>
-          <w:p/>
+          <w:p>
+            <w:r>
+              <w:t>Fri 10/23</w:t>
+            </w:r>
+          </w:p>
         </w:tc>
         <w:tc>
           <w:tcPr>
@@ -7815,7 +7867,696 @@
               <w:right w:w="100" w:type="dxa"/>
             </w:tcMar>
           </w:tcPr>
-          <w:p/>
+          <w:p>
+            <w:r>
+              <w:t xml:space="preserve">TypeScript, React (maybe </w:t>
+            </w:r>
+            <w:r>
+              <w:t>V</w:t>
+            </w:r>
+            <w:r>
+              <w:t>ue), node.js, MySQL</w:t>
+            </w:r>
+          </w:p>
+        </w:tc>
+      </w:tr>
+      <w:tr>
+        <w:tc>
+          <w:tcPr>
+            <w:tcW w:w="600" w:type="dxa"/>
+            <w:tcMar>
+              <w:top w:w="70" w:type="dxa"/>
+              <w:left w:w="100" w:type="dxa"/>
+              <w:bottom w:w="70" w:type="dxa"/>
+              <w:right w:w="100" w:type="dxa"/>
+            </w:tcMar>
+          </w:tcPr>
+          <w:p>
+            <w:pPr>
+              <w:rPr>
+                <w:color w:val="1A1A1A"/>
+                <w:sz w:val="18"/>
+                <w:szCs w:val="18"/>
+              </w:rPr>
+            </w:pPr>
+            <w:r>
+              <w:rPr>
+                <w:color w:val="1A1A1A"/>
+                <w:sz w:val="18"/>
+                <w:szCs w:val="18"/>
+              </w:rPr>
+              <w:t>Q4</w:t>
+            </w:r>
+          </w:p>
+        </w:tc>
+        <w:tc>
+          <w:tcPr>
+            <w:tcW w:w="3600" w:type="dxa"/>
+            <w:tcMar>
+              <w:top w:w="70" w:type="dxa"/>
+              <w:left w:w="100" w:type="dxa"/>
+              <w:bottom w:w="70" w:type="dxa"/>
+              <w:right w:w="100" w:type="dxa"/>
+            </w:tcMar>
+          </w:tcPr>
+          <w:p>
+            <w:r>
+              <w:t>Which user roles are in scope: customer, host, server, manager, kitchen?</w:t>
+            </w:r>
+          </w:p>
+        </w:tc>
+        <w:tc>
+          <w:tcPr>
+            <w:tcW w:w="2000" w:type="dxa"/>
+            <w:tcMar>
+              <w:top w:w="70" w:type="dxa"/>
+              <w:left w:w="100" w:type="dxa"/>
+              <w:bottom w:w="70" w:type="dxa"/>
+              <w:right w:w="100" w:type="dxa"/>
+            </w:tcMar>
+          </w:tcPr>
+          <w:p>
+            <w:r>
+              <w:t>Project Lead and Analysts</w:t>
+            </w:r>
+          </w:p>
+        </w:tc>
+        <w:tc>
+          <w:tcPr>
+            <w:tcW w:w="1200" w:type="dxa"/>
+            <w:tcMar>
+              <w:top w:w="70" w:type="dxa"/>
+              <w:left w:w="100" w:type="dxa"/>
+              <w:bottom w:w="70" w:type="dxa"/>
+              <w:right w:w="100" w:type="dxa"/>
+            </w:tcMar>
+          </w:tcPr>
+          <w:p>
+            <w:r>
+              <w:t>Fri 10/23</w:t>
+            </w:r>
+          </w:p>
+        </w:tc>
+        <w:tc>
+          <w:tcPr>
+            <w:tcW w:w="3458" w:type="dxa"/>
+            <w:tcMar>
+              <w:top w:w="70" w:type="dxa"/>
+              <w:left w:w="100" w:type="dxa"/>
+              <w:bottom w:w="70" w:type="dxa"/>
+              <w:right w:w="100" w:type="dxa"/>
+            </w:tcMar>
+          </w:tcPr>
+          <w:p>
+            <w:r>
+              <w:t>Customer, host, server, and manager. Kitchen is out of scope.</w:t>
+            </w:r>
+          </w:p>
+        </w:tc>
+      </w:tr>
+      <w:tr>
+        <w:tc>
+          <w:tcPr>
+            <w:tcW w:w="600" w:type="dxa"/>
+            <w:tcMar>
+              <w:top w:w="70" w:type="dxa"/>
+              <w:left w:w="100" w:type="dxa"/>
+              <w:bottom w:w="70" w:type="dxa"/>
+              <w:right w:w="100" w:type="dxa"/>
+            </w:tcMar>
+          </w:tcPr>
+          <w:p>
+            <w:pPr>
+              <w:rPr>
+                <w:color w:val="1A1A1A"/>
+                <w:sz w:val="18"/>
+                <w:szCs w:val="18"/>
+              </w:rPr>
+            </w:pPr>
+            <w:r>
+              <w:rPr>
+                <w:color w:val="1A1A1A"/>
+                <w:sz w:val="18"/>
+                <w:szCs w:val="18"/>
+              </w:rPr>
+              <w:t>Q5</w:t>
+            </w:r>
+          </w:p>
+        </w:tc>
+        <w:tc>
+          <w:tcPr>
+            <w:tcW w:w="3600" w:type="dxa"/>
+            <w:tcMar>
+              <w:top w:w="70" w:type="dxa"/>
+              <w:left w:w="100" w:type="dxa"/>
+              <w:bottom w:w="70" w:type="dxa"/>
+              <w:right w:w="100" w:type="dxa"/>
+            </w:tcMar>
+          </w:tcPr>
+          <w:p>
+            <w:r>
+              <w:t>Is this a single restaurant or multiple locations?</w:t>
+            </w:r>
+          </w:p>
+        </w:tc>
+        <w:tc>
+          <w:tcPr>
+            <w:tcW w:w="2000" w:type="dxa"/>
+            <w:tcMar>
+              <w:top w:w="70" w:type="dxa"/>
+              <w:left w:w="100" w:type="dxa"/>
+              <w:bottom w:w="70" w:type="dxa"/>
+              <w:right w:w="100" w:type="dxa"/>
+            </w:tcMar>
+          </w:tcPr>
+          <w:p>
+            <w:r>
+              <w:t>Instructor and Project Lead</w:t>
+            </w:r>
+          </w:p>
+        </w:tc>
+        <w:tc>
+          <w:tcPr>
+            <w:tcW w:w="1200" w:type="dxa"/>
+            <w:tcMar>
+              <w:top w:w="70" w:type="dxa"/>
+              <w:left w:w="100" w:type="dxa"/>
+              <w:bottom w:w="70" w:type="dxa"/>
+              <w:right w:w="100" w:type="dxa"/>
+            </w:tcMar>
+          </w:tcPr>
+          <w:p>
+            <w:r>
+              <w:t>Fri 10/23</w:t>
+            </w:r>
+          </w:p>
+        </w:tc>
+        <w:tc>
+          <w:tcPr>
+            <w:tcW w:w="3458" w:type="dxa"/>
+            <w:tcMar>
+              <w:top w:w="70" w:type="dxa"/>
+              <w:left w:w="100" w:type="dxa"/>
+              <w:bottom w:w="70" w:type="dxa"/>
+              <w:right w:w="100" w:type="dxa"/>
+            </w:tcMar>
+          </w:tcPr>
+          <w:p>
+            <w:r>
+              <w:t>Single location only</w:t>
+            </w:r>
+          </w:p>
+        </w:tc>
+      </w:tr>
+      <w:tr>
+        <w:tc>
+          <w:tcPr>
+            <w:tcW w:w="600" w:type="dxa"/>
+            <w:tcMar>
+              <w:top w:w="70" w:type="dxa"/>
+              <w:left w:w="100" w:type="dxa"/>
+              <w:bottom w:w="70" w:type="dxa"/>
+              <w:right w:w="100" w:type="dxa"/>
+            </w:tcMar>
+          </w:tcPr>
+          <w:p>
+            <w:pPr>
+              <w:rPr>
+                <w:color w:val="1A1A1A"/>
+                <w:sz w:val="18"/>
+                <w:szCs w:val="18"/>
+              </w:rPr>
+            </w:pPr>
+            <w:r>
+              <w:rPr>
+                <w:color w:val="1A1A1A"/>
+                <w:sz w:val="18"/>
+                <w:szCs w:val="18"/>
+              </w:rPr>
+              <w:t>Q6</w:t>
+            </w:r>
+          </w:p>
+        </w:tc>
+        <w:tc>
+          <w:tcPr>
+            <w:tcW w:w="3600" w:type="dxa"/>
+            <w:tcMar>
+              <w:top w:w="70" w:type="dxa"/>
+              <w:left w:w="100" w:type="dxa"/>
+              <w:bottom w:w="70" w:type="dxa"/>
+              <w:right w:w="100" w:type="dxa"/>
+            </w:tcMar>
+          </w:tcPr>
+          <w:p>
+            <w:r>
+              <w:t>How long is a standard reservation slot, and is there a buffer between seatings?</w:t>
+            </w:r>
+          </w:p>
+        </w:tc>
+        <w:tc>
+          <w:tcPr>
+            <w:tcW w:w="2000" w:type="dxa"/>
+            <w:tcMar>
+              <w:top w:w="70" w:type="dxa"/>
+              <w:left w:w="100" w:type="dxa"/>
+              <w:bottom w:w="70" w:type="dxa"/>
+              <w:right w:w="100" w:type="dxa"/>
+            </w:tcMar>
+          </w:tcPr>
+          <w:p>
+            <w:r>
+              <w:t>Analysts</w:t>
+            </w:r>
+          </w:p>
+        </w:tc>
+        <w:tc>
+          <w:tcPr>
+            <w:tcW w:w="1200" w:type="dxa"/>
+            <w:tcMar>
+              <w:top w:w="70" w:type="dxa"/>
+              <w:left w:w="100" w:type="dxa"/>
+              <w:bottom w:w="70" w:type="dxa"/>
+              <w:right w:w="100" w:type="dxa"/>
+            </w:tcMar>
+          </w:tcPr>
+          <w:p>
+            <w:r>
+              <w:t>Fri 10/30</w:t>
+            </w:r>
+          </w:p>
+        </w:tc>
+        <w:tc>
+          <w:tcPr>
+            <w:tcW w:w="3458" w:type="dxa"/>
+            <w:tcMar>
+              <w:top w:w="70" w:type="dxa"/>
+              <w:left w:w="100" w:type="dxa"/>
+              <w:bottom w:w="70" w:type="dxa"/>
+              <w:right w:w="100" w:type="dxa"/>
+            </w:tcMar>
+          </w:tcPr>
+          <w:p>
+            <w:r>
+              <w:t>90-minute seatings with a 15-minute cleaning buffer</w:t>
+            </w:r>
+          </w:p>
+        </w:tc>
+      </w:tr>
+      <w:tr>
+        <w:tc>
+          <w:tcPr>
+            <w:tcW w:w="600" w:type="dxa"/>
+            <w:tcMar>
+              <w:top w:w="70" w:type="dxa"/>
+              <w:left w:w="100" w:type="dxa"/>
+              <w:bottom w:w="70" w:type="dxa"/>
+              <w:right w:w="100" w:type="dxa"/>
+            </w:tcMar>
+          </w:tcPr>
+          <w:p>
+            <w:pPr>
+              <w:rPr>
+                <w:color w:val="1A1A1A"/>
+                <w:sz w:val="18"/>
+                <w:szCs w:val="18"/>
+              </w:rPr>
+            </w:pPr>
+            <w:r>
+              <w:rPr>
+                <w:color w:val="1A1A1A"/>
+                <w:sz w:val="18"/>
+                <w:szCs w:val="18"/>
+              </w:rPr>
+              <w:t>Q7</w:t>
+            </w:r>
+          </w:p>
+        </w:tc>
+        <w:tc>
+          <w:tcPr>
+            <w:tcW w:w="3600" w:type="dxa"/>
+            <w:tcMar>
+              <w:top w:w="70" w:type="dxa"/>
+              <w:left w:w="100" w:type="dxa"/>
+              <w:bottom w:w="70" w:type="dxa"/>
+              <w:right w:w="100" w:type="dxa"/>
+            </w:tcMar>
+          </w:tcPr>
+          <w:p>
+            <w:r>
+              <w:t>Should the system assign tables automatically, or does the host pick them?</w:t>
+            </w:r>
+          </w:p>
+        </w:tc>
+        <w:tc>
+          <w:tcPr>
+            <w:tcW w:w="2000" w:type="dxa"/>
+            <w:tcMar>
+              <w:top w:w="70" w:type="dxa"/>
+              <w:left w:w="100" w:type="dxa"/>
+              <w:bottom w:w="70" w:type="dxa"/>
+              <w:right w:w="100" w:type="dxa"/>
+            </w:tcMar>
+          </w:tcPr>
+          <w:p>
+            <w:r>
+              <w:t>Analysts and Architect</w:t>
+            </w:r>
+          </w:p>
+        </w:tc>
+        <w:tc>
+          <w:tcPr>
+            <w:tcW w:w="1200" w:type="dxa"/>
+            <w:tcMar>
+              <w:top w:w="70" w:type="dxa"/>
+              <w:left w:w="100" w:type="dxa"/>
+              <w:bottom w:w="70" w:type="dxa"/>
+              <w:right w:w="100" w:type="dxa"/>
+            </w:tcMar>
+          </w:tcPr>
+          <w:p>
+            <w:r>
+              <w:t>Fri 10/30</w:t>
+            </w:r>
+          </w:p>
+        </w:tc>
+        <w:tc>
+          <w:tcPr>
+            <w:tcW w:w="3458" w:type="dxa"/>
+            <w:tcMar>
+              <w:top w:w="70" w:type="dxa"/>
+              <w:left w:w="100" w:type="dxa"/>
+              <w:bottom w:w="70" w:type="dxa"/>
+              <w:right w:w="100" w:type="dxa"/>
+            </w:tcMar>
+          </w:tcPr>
+          <w:p>
+            <w:r>
+              <w:t>System suggests the smallest table that fits</w:t>
+            </w:r>
+            <w:r>
+              <w:t>,</w:t>
+            </w:r>
+            <w:r>
+              <w:t xml:space="preserve"> host can override</w:t>
+            </w:r>
+          </w:p>
+        </w:tc>
+      </w:tr>
+      <w:tr>
+        <w:tc>
+          <w:tcPr>
+            <w:tcW w:w="600" w:type="dxa"/>
+            <w:tcMar>
+              <w:top w:w="70" w:type="dxa"/>
+              <w:left w:w="100" w:type="dxa"/>
+              <w:bottom w:w="70" w:type="dxa"/>
+              <w:right w:w="100" w:type="dxa"/>
+            </w:tcMar>
+          </w:tcPr>
+          <w:p>
+            <w:pPr>
+              <w:rPr>
+                <w:color w:val="1A1A1A"/>
+                <w:sz w:val="18"/>
+                <w:szCs w:val="18"/>
+              </w:rPr>
+            </w:pPr>
+            <w:r>
+              <w:rPr>
+                <w:color w:val="1A1A1A"/>
+                <w:sz w:val="18"/>
+                <w:szCs w:val="18"/>
+              </w:rPr>
+              <w:t>Q8</w:t>
+            </w:r>
+          </w:p>
+        </w:tc>
+        <w:tc>
+          <w:tcPr>
+            <w:tcW w:w="3600" w:type="dxa"/>
+            <w:tcMar>
+              <w:top w:w="70" w:type="dxa"/>
+              <w:left w:w="100" w:type="dxa"/>
+              <w:bottom w:w="70" w:type="dxa"/>
+              <w:right w:w="100" w:type="dxa"/>
+            </w:tcMar>
+          </w:tcPr>
+          <w:p>
+            <w:r>
+              <w:t>How are no-shows and late arrivals handled?</w:t>
+            </w:r>
+          </w:p>
+        </w:tc>
+        <w:tc>
+          <w:tcPr>
+            <w:tcW w:w="2000" w:type="dxa"/>
+            <w:tcMar>
+              <w:top w:w="70" w:type="dxa"/>
+              <w:left w:w="100" w:type="dxa"/>
+              <w:bottom w:w="70" w:type="dxa"/>
+              <w:right w:w="100" w:type="dxa"/>
+            </w:tcMar>
+          </w:tcPr>
+          <w:p>
+            <w:r>
+              <w:t>Analysts</w:t>
+            </w:r>
+          </w:p>
+        </w:tc>
+        <w:tc>
+          <w:tcPr>
+            <w:tcW w:w="1200" w:type="dxa"/>
+            <w:tcMar>
+              <w:top w:w="70" w:type="dxa"/>
+              <w:left w:w="100" w:type="dxa"/>
+              <w:bottom w:w="70" w:type="dxa"/>
+              <w:right w:w="100" w:type="dxa"/>
+            </w:tcMar>
+          </w:tcPr>
+          <w:p>
+            <w:r>
+              <w:t>Fri 10/30</w:t>
+            </w:r>
+          </w:p>
+        </w:tc>
+        <w:tc>
+          <w:tcPr>
+            <w:tcW w:w="3458" w:type="dxa"/>
+            <w:tcMar>
+              <w:top w:w="70" w:type="dxa"/>
+              <w:left w:w="100" w:type="dxa"/>
+              <w:bottom w:w="70" w:type="dxa"/>
+              <w:right w:w="100" w:type="dxa"/>
+            </w:tcMar>
+          </w:tcPr>
+          <w:p>
+            <w:r>
+              <w:t>Marked as a no-show after 15 minutes late, and the table is released</w:t>
+            </w:r>
+          </w:p>
+        </w:tc>
+      </w:tr>
+      <w:tr>
+        <w:tc>
+          <w:tcPr>
+            <w:tcW w:w="600" w:type="dxa"/>
+            <w:tcMar>
+              <w:top w:w="70" w:type="dxa"/>
+              <w:left w:w="100" w:type="dxa"/>
+              <w:bottom w:w="70" w:type="dxa"/>
+              <w:right w:w="100" w:type="dxa"/>
+            </w:tcMar>
+          </w:tcPr>
+          <w:p>
+            <w:pPr>
+              <w:rPr>
+                <w:color w:val="1A1A1A"/>
+                <w:sz w:val="18"/>
+                <w:szCs w:val="18"/>
+              </w:rPr>
+            </w:pPr>
+            <w:r>
+              <w:rPr>
+                <w:color w:val="1A1A1A"/>
+                <w:sz w:val="18"/>
+                <w:szCs w:val="18"/>
+              </w:rPr>
+              <w:t>Q9</w:t>
+            </w:r>
+          </w:p>
+        </w:tc>
+        <w:tc>
+          <w:tcPr>
+            <w:tcW w:w="3600" w:type="dxa"/>
+            <w:tcMar>
+              <w:top w:w="70" w:type="dxa"/>
+              <w:left w:w="100" w:type="dxa"/>
+              <w:bottom w:w="70" w:type="dxa"/>
+              <w:right w:w="100" w:type="dxa"/>
+            </w:tcMar>
+          </w:tcPr>
+          <w:p>
+            <w:r>
+              <w:t>Are there accessibility or mobile requirements (e</w:t>
+            </w:r>
+            <w:r>
+              <w:t>x:</w:t>
+            </w:r>
+            <w:r>
+              <w:t xml:space="preserve"> hosts using a tablet)?</w:t>
+            </w:r>
+          </w:p>
+        </w:tc>
+        <w:tc>
+          <w:tcPr>
+            <w:tcW w:w="2000" w:type="dxa"/>
+            <w:tcMar>
+              <w:top w:w="70" w:type="dxa"/>
+              <w:left w:w="100" w:type="dxa"/>
+              <w:bottom w:w="70" w:type="dxa"/>
+              <w:right w:w="100" w:type="dxa"/>
+            </w:tcMar>
+          </w:tcPr>
+          <w:p>
+            <w:r>
+              <w:t>Instructor and Analysts</w:t>
+            </w:r>
+          </w:p>
+        </w:tc>
+        <w:tc>
+          <w:tcPr>
+            <w:tcW w:w="1200" w:type="dxa"/>
+            <w:tcMar>
+              <w:top w:w="70" w:type="dxa"/>
+              <w:left w:w="100" w:type="dxa"/>
+              <w:bottom w:w="70" w:type="dxa"/>
+              <w:right w:w="100" w:type="dxa"/>
+            </w:tcMar>
+          </w:tcPr>
+          <w:p>
+            <w:r>
+              <w:t>Fri 11/6</w:t>
+            </w:r>
+          </w:p>
+        </w:tc>
+        <w:tc>
+          <w:tcPr>
+            <w:tcW w:w="3458" w:type="dxa"/>
+            <w:tcMar>
+              <w:top w:w="70" w:type="dxa"/>
+              <w:left w:w="100" w:type="dxa"/>
+              <w:bottom w:w="70" w:type="dxa"/>
+              <w:right w:w="100" w:type="dxa"/>
+            </w:tcMar>
+          </w:tcPr>
+          <w:p>
+            <w:r>
+              <w:t xml:space="preserve">Responsive web pages that work </w:t>
+            </w:r>
+            <w:r>
+              <w:t>on variable screen sizes</w:t>
+            </w:r>
+          </w:p>
+        </w:tc>
+      </w:tr>
+      <w:tr>
+        <w:tc>
+          <w:tcPr>
+            <w:tcW w:w="600" w:type="dxa"/>
+            <w:tcMar>
+              <w:top w:w="70" w:type="dxa"/>
+              <w:left w:w="100" w:type="dxa"/>
+              <w:bottom w:w="70" w:type="dxa"/>
+              <w:right w:w="100" w:type="dxa"/>
+            </w:tcMar>
+          </w:tcPr>
+          <w:p>
+            <w:pPr>
+              <w:rPr>
+                <w:color w:val="1A1A1A"/>
+                <w:sz w:val="18"/>
+                <w:szCs w:val="18"/>
+              </w:rPr>
+            </w:pPr>
+            <w:r>
+              <w:rPr>
+                <w:color w:val="1A1A1A"/>
+                <w:sz w:val="18"/>
+                <w:szCs w:val="18"/>
+              </w:rPr>
+              <w:t>Q10</w:t>
+            </w:r>
+          </w:p>
+        </w:tc>
+        <w:tc>
+          <w:tcPr>
+            <w:tcW w:w="3600" w:type="dxa"/>
+            <w:tcMar>
+              <w:top w:w="70" w:type="dxa"/>
+              <w:left w:w="100" w:type="dxa"/>
+              <w:bottom w:w="70" w:type="dxa"/>
+              <w:right w:w="100" w:type="dxa"/>
+            </w:tcMar>
+          </w:tcPr>
+          <w:p>
+            <w:r>
+              <w:t>Is a waitlist required, or a stretch goal?</w:t>
+            </w:r>
+          </w:p>
+        </w:tc>
+        <w:tc>
+          <w:tcPr>
+            <w:tcW w:w="2000" w:type="dxa"/>
+            <w:tcMar>
+              <w:top w:w="70" w:type="dxa"/>
+              <w:left w:w="100" w:type="dxa"/>
+              <w:bottom w:w="70" w:type="dxa"/>
+              <w:right w:w="100" w:type="dxa"/>
+            </w:tcMar>
+          </w:tcPr>
+          <w:p>
+            <w:r>
+              <w:t>Project Lead</w:t>
+            </w:r>
+          </w:p>
+        </w:tc>
+        <w:tc>
+          <w:tcPr>
+            <w:tcW w:w="1200" w:type="dxa"/>
+            <w:tcMar>
+              <w:top w:w="70" w:type="dxa"/>
+              <w:left w:w="100" w:type="dxa"/>
+              <w:bottom w:w="70" w:type="dxa"/>
+              <w:right w:w="100" w:type="dxa"/>
+            </w:tcMar>
+          </w:tcPr>
+          <w:p>
+            <w:r>
+              <w:t>Fri 10/30</w:t>
+            </w:r>
+          </w:p>
+        </w:tc>
+        <w:tc>
+          <w:tcPr>
+            <w:tcW w:w="3458" w:type="dxa"/>
+            <w:tcMar>
+              <w:top w:w="70" w:type="dxa"/>
+              <w:left w:w="100" w:type="dxa"/>
+              <w:bottom w:w="70" w:type="dxa"/>
+              <w:right w:w="100" w:type="dxa"/>
+            </w:tcMar>
+          </w:tcPr>
+          <w:p>
+            <w:r>
+              <w:t>Stretch goal</w:t>
+            </w:r>
+            <w:r>
+              <w:t>,</w:t>
+            </w:r>
+            <w:r>
+              <w:t xml:space="preserve"> build it only if the core reservation flow is done</w:t>
+            </w:r>
+          </w:p>
         </w:tc>
       </w:tr>
     </w:tbl>
@@ -7838,7 +8579,6 @@
           <w:color w:val="16324F"/>
           <w:sz w:val="26"/>
           <w:szCs w:val="26"/>
-          <w:lang w:val="en-US"/>
         </w:rPr>
       </w:pPr>
       <w:r>
@@ -7850,7 +8590,6 @@
           <w:sz w:val="26"/>
           <w:szCs w:val="26"/>
         </w:rPr>
-        <w:lastRenderedPageBreak/>
         <w:t xml:space="preserve">6   </w:t>
       </w:r>
       <w:r>
@@ -7879,7 +8618,6 @@
           <w:color w:val="16324F"/>
           <w:sz w:val="26"/>
           <w:szCs w:val="26"/>
-          <w:lang w:val="en-US"/>
         </w:rPr>
       </w:pPr>
     </w:p>
@@ -8021,7 +8759,11 @@
               <w:right w:w="100" w:type="dxa"/>
             </w:tcMar>
           </w:tcPr>
-          <w:p/>
+          <w:p>
+            <w:r>
+              <w:t>Manideep</w:t>
+            </w:r>
+          </w:p>
         </w:tc>
         <w:tc>
           <w:tcPr>
@@ -8033,7 +8775,11 @@
               <w:right w:w="100" w:type="dxa"/>
             </w:tcMar>
           </w:tcPr>
-          <w:p/>
+          <w:p>
+            <w:r>
+              <w:t>Manideep Pendyala</w:t>
+            </w:r>
+          </w:p>
         </w:tc>
         <w:tc>
           <w:tcPr>
@@ -8045,7 +8791,11 @@
               <w:right w:w="100" w:type="dxa"/>
             </w:tcMar>
           </w:tcPr>
-          <w:p/>
+          <w:p>
+            <w:r>
+              <w:t>10/18/2026</w:t>
+            </w:r>
+          </w:p>
         </w:tc>
       </w:tr>
       <w:tr>
@@ -8862,7 +9612,7 @@
 </file>
 
 <file path=word/endnotes.xml><?xml version="1.0" encoding="utf-8"?>
-<w:endnotes xmlns:wpc="http://schemas.microsoft.com/office/word/2010/wordprocessingCanvas" xmlns:cx="http://schemas.microsoft.com/office/drawing/2014/chartex" xmlns:cx1="http://schemas.microsoft.com/office/drawing/2015/9/8/chartex" xmlns:cx2="http://schemas.microsoft.com/office/drawing/2015/10/21/chartex" xmlns:cx3="http://schemas.microsoft.com/office/drawing/2016/5/9/chartex" xmlns:cx4="http://schemas.microsoft.com/office/drawing/2016/5/10/chartex" xmlns:cx5="http://schemas.microsoft.com/office/drawing/2016/5/11/chartex" xmlns:cx6="http://schemas.microsoft.com/office/drawing/2016/5/12/chartex" xmlns:cx7="http://schemas.microsoft.com/office/drawing/2016/5/13/chartex" xmlns:cx8="http://schemas.microsoft.com/office/drawing/2016/5/14/chartex" xmlns:mc="http://schemas.openxmlformats.org/markup-compatibility/2006" xmlns:aink="http://schemas.microsoft.com/office/drawing/2016/ink" xmlns:am3d="http://schemas.microsoft.com/office/drawing/2017/model3d" xmlns:o="urn:schemas-microsoft-com:office:office" xmlns:oel="http://schemas.microsoft.com/office/2019/extlst" xmlns:r="http://schemas.openxmlformats.org/officeDocument/2006/relationships" xmlns:m="http://schemas.openxmlformats.org/officeDocument/2006/math" xmlns:v="urn:schemas-microsoft-com:vml" xmlns:wp14="http://schemas.microsoft.com/office/word/2010/wordprocessingDrawing" xmlns:wp="http://schemas.openxmlformats.org/drawingml/2006/wordprocessingDrawing" xmlns:w10="urn:schemas-microsoft-com:office:word" xmlns:w="http://schemas.openxmlformats.org/wordprocessingml/2006/main" xmlns:w14="http://schemas.microsoft.com/office/word/2010/wordml" xmlns:w15="http://schemas.microsoft.com/office/word/2012/wordml" xmlns:w16cex="http://schemas.microsoft.com/office/word/2018/wordml/cex" xmlns:w16cid="http://schemas.microsoft.com/office/word/2016/wordml/cid" xmlns:w16="http://schemas.microsoft.com/office/word/2018/wordml" xmlns:w16du="http://schemas.microsoft.com/office/word/2023/wordml/word16du" xmlns:w16sdtdh="http://schemas.microsoft.com/office/word/2020/wordml/sdtdatahash" xmlns:w16se="http://schemas.microsoft.com/office/word/2015/wordml/symex" xmlns:wpg="http://schemas.microsoft.com/office/word/2010/wordprocessingGroup" xmlns:wpi="http://schemas.microsoft.com/office/word/2010/wordprocessingInk" xmlns:wne="http://schemas.microsoft.com/office/word/2006/wordml" xmlns:wps="http://schemas.microsoft.com/office/word/2010/wordprocessingShape" mc:Ignorable="w14 w15 w16se w16cid w16 w16cex w16sdtdh w16du wp14">
+<w:endnotes xmlns:wpc="http://schemas.microsoft.com/office/word/2010/wordprocessingCanvas" xmlns:cx="http://schemas.microsoft.com/office/drawing/2014/chartex" xmlns:cx1="http://schemas.microsoft.com/office/drawing/2015/9/8/chartex" xmlns:cx2="http://schemas.microsoft.com/office/drawing/2015/10/21/chartex" xmlns:cx3="http://schemas.microsoft.com/office/drawing/2016/5/9/chartex" xmlns:cx4="http://schemas.microsoft.com/office/drawing/2016/5/10/chartex" xmlns:cx5="http://schemas.microsoft.com/office/drawing/2016/5/11/chartex" xmlns:cx6="http://schemas.microsoft.com/office/drawing/2016/5/12/chartex" xmlns:cx7="http://schemas.microsoft.com/office/drawing/2016/5/13/chartex" xmlns:cx8="http://schemas.microsoft.com/office/drawing/2016/5/14/chartex" xmlns:mc="http://schemas.openxmlformats.org/markup-compatibility/2006" xmlns:m="http://schemas.openxmlformats.org/officeDocument/2006/math" xmlns:aink="http://schemas.microsoft.com/office/drawing/2016/ink" xmlns:am3d="http://schemas.microsoft.com/office/drawing/2017/model3d" xmlns:oel="http://schemas.microsoft.com/office/2019/extlst" xmlns:r="http://schemas.openxmlformats.org/officeDocument/2006/relationships" xmlns:wp14="http://schemas.microsoft.com/office/word/2010/wordprocessingDrawing" xmlns:wp="http://schemas.openxmlformats.org/drawingml/2006/wordprocessingDrawing" xmlns:wpg="http://schemas.microsoft.com/office/word/2010/wordprocessingGroup" xmlns:wpi="http://schemas.microsoft.com/office/word/2010/wordprocessingInk" xmlns:wps="http://schemas.microsoft.com/office/word/2010/wordprocessingShape" xmlns:o="urn:schemas-microsoft-com:office:office" xmlns:v="urn:schemas-microsoft-com:vml" xmlns:w10="urn:schemas-microsoft-com:office:word" xmlns:w="http://schemas.openxmlformats.org/wordprocessingml/2006/main" xmlns:w14="http://schemas.microsoft.com/office/word/2010/wordml" xmlns:w15="http://schemas.microsoft.com/office/word/2012/wordml" xmlns:w16cex="http://schemas.microsoft.com/office/word/2018/wordml/cex" xmlns:w16cid="http://schemas.microsoft.com/office/word/2016/wordml/cid" xmlns:w16="http://schemas.microsoft.com/office/word/2018/wordml" xmlns:w16sdtdh="http://schemas.microsoft.com/office/word/2020/wordml/sdtdatahash" xmlns:w16sdtfl="http://schemas.microsoft.com/office/word/2024/wordml/sdtformatlock" xmlns:w16se="http://schemas.microsoft.com/office/word/2015/wordml/symex" xmlns:w16du="http://schemas.microsoft.com/office/word/2023/wordml/word16du" xmlns:wne="http://schemas.microsoft.com/office/word/2006/wordml" mc:Ignorable="w14 w15 w16se w16cid w16 w16cex w16sdtdh w16sdtfl w16du wp14">
   <w:endnote w:type="separator" w:id="-1">
     <w:p>
       <w:r>
@@ -8881,7 +9631,7 @@
 </file>
 
 <file path=word/footer1.xml><?xml version="1.0" encoding="utf-8"?>
-<w:ftr xmlns:wpc="http://schemas.microsoft.com/office/word/2010/wordprocessingCanvas" xmlns:cx="http://schemas.microsoft.com/office/drawing/2014/chartex" xmlns:cx1="http://schemas.microsoft.com/office/drawing/2015/9/8/chartex" xmlns:cx2="http://schemas.microsoft.com/office/drawing/2015/10/21/chartex" xmlns:cx3="http://schemas.microsoft.com/office/drawing/2016/5/9/chartex" xmlns:cx4="http://schemas.microsoft.com/office/drawing/2016/5/10/chartex" xmlns:cx5="http://schemas.microsoft.com/office/drawing/2016/5/11/chartex" xmlns:cx6="http://schemas.microsoft.com/office/drawing/2016/5/12/chartex" xmlns:cx7="http://schemas.microsoft.com/office/drawing/2016/5/13/chartex" xmlns:cx8="http://schemas.microsoft.com/office/drawing/2016/5/14/chartex" xmlns:mc="http://schemas.openxmlformats.org/markup-compatibility/2006" xmlns:aink="http://schemas.microsoft.com/office/drawing/2016/ink" xmlns:am3d="http://schemas.microsoft.com/office/drawing/2017/model3d" xmlns:o="urn:schemas-microsoft-com:office:office" xmlns:oel="http://schemas.microsoft.com/office/2019/extlst" xmlns:r="http://schemas.openxmlformats.org/officeDocument/2006/relationships" xmlns:m="http://schemas.openxmlformats.org/officeDocument/2006/math" xmlns:v="urn:schemas-microsoft-com:vml" xmlns:wp14="http://schemas.microsoft.com/office/word/2010/wordprocessingDrawing" xmlns:wp="http://schemas.openxmlformats.org/drawingml/2006/wordprocessingDrawing" xmlns:w10="urn:schemas-microsoft-com:office:word" xmlns:w="http://schemas.openxmlformats.org/wordprocessingml/2006/main" xmlns:w14="http://schemas.microsoft.com/office/word/2010/wordml" xmlns:w15="http://schemas.microsoft.com/office/word/2012/wordml" xmlns:w16cex="http://schemas.microsoft.com/office/word/2018/wordml/cex" xmlns:w16cid="http://schemas.microsoft.com/office/word/2016/wordml/cid" xmlns:w16="http://schemas.microsoft.com/office/word/2018/wordml" xmlns:w16du="http://schemas.microsoft.com/office/word/2023/wordml/word16du" xmlns:w16sdtdh="http://schemas.microsoft.com/office/word/2020/wordml/sdtdatahash" xmlns:w16se="http://schemas.microsoft.com/office/word/2015/wordml/symex" xmlns:wpg="http://schemas.microsoft.com/office/word/2010/wordprocessingGroup" xmlns:wpi="http://schemas.microsoft.com/office/word/2010/wordprocessingInk" xmlns:wne="http://schemas.microsoft.com/office/word/2006/wordml" xmlns:wps="http://schemas.microsoft.com/office/word/2010/wordprocessingShape" mc:Ignorable="w14 w15 w16se w16cid w16 w16cex w16sdtdh w16du wp14">
+<w:ftr xmlns:wpc="http://schemas.microsoft.com/office/word/2010/wordprocessingCanvas" xmlns:cx="http://schemas.microsoft.com/office/drawing/2014/chartex" xmlns:cx1="http://schemas.microsoft.com/office/drawing/2015/9/8/chartex" xmlns:cx2="http://schemas.microsoft.com/office/drawing/2015/10/21/chartex" xmlns:cx3="http://schemas.microsoft.com/office/drawing/2016/5/9/chartex" xmlns:cx4="http://schemas.microsoft.com/office/drawing/2016/5/10/chartex" xmlns:cx5="http://schemas.microsoft.com/office/drawing/2016/5/11/chartex" xmlns:cx6="http://schemas.microsoft.com/office/drawing/2016/5/12/chartex" xmlns:cx7="http://schemas.microsoft.com/office/drawing/2016/5/13/chartex" xmlns:cx8="http://schemas.microsoft.com/office/drawing/2016/5/14/chartex" xmlns:mc="http://schemas.openxmlformats.org/markup-compatibility/2006" xmlns:m="http://schemas.openxmlformats.org/officeDocument/2006/math" xmlns:aink="http://schemas.microsoft.com/office/drawing/2016/ink" xmlns:am3d="http://schemas.microsoft.com/office/drawing/2017/model3d" xmlns:oel="http://schemas.microsoft.com/office/2019/extlst" xmlns:r="http://schemas.openxmlformats.org/officeDocument/2006/relationships" xmlns:wp14="http://schemas.microsoft.com/office/word/2010/wordprocessingDrawing" xmlns:wp="http://schemas.openxmlformats.org/drawingml/2006/wordprocessingDrawing" xmlns:wpg="http://schemas.microsoft.com/office/word/2010/wordprocessingGroup" xmlns:wpi="http://schemas.microsoft.com/office/word/2010/wordprocessingInk" xmlns:wps="http://schemas.microsoft.com/office/word/2010/wordprocessingShape" xmlns:o="urn:schemas-microsoft-com:office:office" xmlns:v="urn:schemas-microsoft-com:vml" xmlns:w10="urn:schemas-microsoft-com:office:word" xmlns:w="http://schemas.openxmlformats.org/wordprocessingml/2006/main" xmlns:w14="http://schemas.microsoft.com/office/word/2010/wordml" xmlns:w15="http://schemas.microsoft.com/office/word/2012/wordml" xmlns:w16cex="http://schemas.microsoft.com/office/word/2018/wordml/cex" xmlns:w16cid="http://schemas.microsoft.com/office/word/2016/wordml/cid" xmlns:w16="http://schemas.microsoft.com/office/word/2018/wordml" xmlns:w16sdtdh="http://schemas.microsoft.com/office/word/2020/wordml/sdtdatahash" xmlns:w16sdtfl="http://schemas.microsoft.com/office/word/2024/wordml/sdtformatlock" xmlns:w16se="http://schemas.microsoft.com/office/word/2015/wordml/symex" xmlns:w16du="http://schemas.microsoft.com/office/word/2023/wordml/word16du" xmlns:wne="http://schemas.microsoft.com/office/word/2006/wordml" mc:Ignorable="w14 w15 w16se w16cid w16 w16cex w16sdtdh w16sdtfl w16du wp14">
   <w:p>
     <w:pPr>
       <w:spacing w:before="60"/>
@@ -8990,7 +9740,7 @@
 </file>
 
 <file path=word/footnotes.xml><?xml version="1.0" encoding="utf-8"?>
-<w:footnotes xmlns:wpc="http://schemas.microsoft.com/office/word/2010/wordprocessingCanvas" xmlns:cx="http://schemas.microsoft.com/office/drawing/2014/chartex" xmlns:cx1="http://schemas.microsoft.com/office/drawing/2015/9/8/chartex" xmlns:cx2="http://schemas.microsoft.com/office/drawing/2015/10/21/chartex" xmlns:cx3="http://schemas.microsoft.com/office/drawing/2016/5/9/chartex" xmlns:cx4="http://schemas.microsoft.com/office/drawing/2016/5/10/chartex" xmlns:cx5="http://schemas.microsoft.com/office/drawing/2016/5/11/chartex" xmlns:cx6="http://schemas.microsoft.com/office/drawing/2016/5/12/chartex" xmlns:cx7="http://schemas.microsoft.com/office/drawing/2016/5/13/chartex" xmlns:cx8="http://schemas.microsoft.com/office/drawing/2016/5/14/chartex" xmlns:mc="http://schemas.openxmlformats.org/markup-compatibility/2006" xmlns:aink="http://schemas.microsoft.com/office/drawing/2016/ink" xmlns:am3d="http://schemas.microsoft.com/office/drawing/2017/model3d" xmlns:o="urn:schemas-microsoft-com:office:office" xmlns:oel="http://schemas.microsoft.com/office/2019/extlst" xmlns:r="http://schemas.openxmlformats.org/officeDocument/2006/relationships" xmlns:m="http://schemas.openxmlformats.org/officeDocument/2006/math" xmlns:v="urn:schemas-microsoft-com:vml" xmlns:wp14="http://schemas.microsoft.com/office/word/2010/wordprocessingDrawing" xmlns:wp="http://schemas.openxmlformats.org/drawingml/2006/wordprocessingDrawing" xmlns:w10="urn:schemas-microsoft-com:office:word" xmlns:w="http://schemas.openxmlformats.org/wordprocessingml/2006/main" xmlns:w14="http://schemas.microsoft.com/office/word/2010/wordml" xmlns:w15="http://schemas.microsoft.com/office/word/2012/wordml" xmlns:w16cex="http://schemas.microsoft.com/office/word/2018/wordml/cex" xmlns:w16cid="http://schemas.microsoft.com/office/word/2016/wordml/cid" xmlns:w16="http://schemas.microsoft.com/office/word/2018/wordml" xmlns:w16du="http://schemas.microsoft.com/office/word/2023/wordml/word16du" xmlns:w16sdtdh="http://schemas.microsoft.com/office/word/2020/wordml/sdtdatahash" xmlns:w16se="http://schemas.microsoft.com/office/word/2015/wordml/symex" xmlns:wpg="http://schemas.microsoft.com/office/word/2010/wordprocessingGroup" xmlns:wpi="http://schemas.microsoft.com/office/word/2010/wordprocessingInk" xmlns:wne="http://schemas.microsoft.com/office/word/2006/wordml" xmlns:wps="http://schemas.microsoft.com/office/word/2010/wordprocessingShape" mc:Ignorable="w14 w15 w16se w16cid w16 w16cex w16sdtdh w16du wp14">
+<w:footnotes xmlns:wpc="http://schemas.microsoft.com/office/word/2010/wordprocessingCanvas" xmlns:cx="http://schemas.microsoft.com/office/drawing/2014/chartex" xmlns:cx1="http://schemas.microsoft.com/office/drawing/2015/9/8/chartex" xmlns:cx2="http://schemas.microsoft.com/office/drawing/2015/10/21/chartex" xmlns:cx3="http://schemas.microsoft.com/office/drawing/2016/5/9/chartex" xmlns:cx4="http://schemas.microsoft.com/office/drawing/2016/5/10/chartex" xmlns:cx5="http://schemas.microsoft.com/office/drawing/2016/5/11/chartex" xmlns:cx6="http://schemas.microsoft.com/office/drawing/2016/5/12/chartex" xmlns:cx7="http://schemas.microsoft.com/office/drawing/2016/5/13/chartex" xmlns:cx8="http://schemas.microsoft.com/office/drawing/2016/5/14/chartex" xmlns:mc="http://schemas.openxmlformats.org/markup-compatibility/2006" xmlns:m="http://schemas.openxmlformats.org/officeDocument/2006/math" xmlns:aink="http://schemas.microsoft.com/office/drawing/2016/ink" xmlns:am3d="http://schemas.microsoft.com/office/drawing/2017/model3d" xmlns:oel="http://schemas.microsoft.com/office/2019/extlst" xmlns:r="http://schemas.openxmlformats.org/officeDocument/2006/relationships" xmlns:wp14="http://schemas.microsoft.com/office/word/2010/wordprocessingDrawing" xmlns:wp="http://schemas.openxmlformats.org/drawingml/2006/wordprocessingDrawing" xmlns:wpg="http://schemas.microsoft.com/office/word/2010/wordprocessingGroup" xmlns:wpi="http://schemas.microsoft.com/office/word/2010/wordprocessingInk" xmlns:wps="http://schemas.microsoft.com/office/word/2010/wordprocessingShape" xmlns:o="urn:schemas-microsoft-com:office:office" xmlns:v="urn:schemas-microsoft-com:vml" xmlns:w10="urn:schemas-microsoft-com:office:word" xmlns:w="http://schemas.openxmlformats.org/wordprocessingml/2006/main" xmlns:w14="http://schemas.microsoft.com/office/word/2010/wordml" xmlns:w15="http://schemas.microsoft.com/office/word/2012/wordml" xmlns:w16cex="http://schemas.microsoft.com/office/word/2018/wordml/cex" xmlns:w16cid="http://schemas.microsoft.com/office/word/2016/wordml/cid" xmlns:w16="http://schemas.microsoft.com/office/word/2018/wordml" xmlns:w16sdtdh="http://schemas.microsoft.com/office/word/2020/wordml/sdtdatahash" xmlns:w16sdtfl="http://schemas.microsoft.com/office/word/2024/wordml/sdtformatlock" xmlns:w16se="http://schemas.microsoft.com/office/word/2015/wordml/symex" xmlns:w16du="http://schemas.microsoft.com/office/word/2023/wordml/word16du" xmlns:wne="http://schemas.microsoft.com/office/word/2006/wordml" mc:Ignorable="w14 w15 w16se w16cid w16 w16cex w16sdtdh w16sdtfl w16du wp14">
   <w:footnote w:type="separator" w:id="-1">
     <w:p>
       <w:r>
@@ -9009,7 +9759,7 @@
 </file>
 
 <file path=word/header1.xml><?xml version="1.0" encoding="utf-8"?>
-<w:hdr xmlns:wpc="http://schemas.microsoft.com/office/word/2010/wordprocessingCanvas" xmlns:cx="http://schemas.microsoft.com/office/drawing/2014/chartex" xmlns:cx1="http://schemas.microsoft.com/office/drawing/2015/9/8/chartex" xmlns:cx2="http://schemas.microsoft.com/office/drawing/2015/10/21/chartex" xmlns:cx3="http://schemas.microsoft.com/office/drawing/2016/5/9/chartex" xmlns:cx4="http://schemas.microsoft.com/office/drawing/2016/5/10/chartex" xmlns:cx5="http://schemas.microsoft.com/office/drawing/2016/5/11/chartex" xmlns:cx6="http://schemas.microsoft.com/office/drawing/2016/5/12/chartex" xmlns:cx7="http://schemas.microsoft.com/office/drawing/2016/5/13/chartex" xmlns:cx8="http://schemas.microsoft.com/office/drawing/2016/5/14/chartex" xmlns:mc="http://schemas.openxmlformats.org/markup-compatibility/2006" xmlns:aink="http://schemas.microsoft.com/office/drawing/2016/ink" xmlns:am3d="http://schemas.microsoft.com/office/drawing/2017/model3d" xmlns:o="urn:schemas-microsoft-com:office:office" xmlns:oel="http://schemas.microsoft.com/office/2019/extlst" xmlns:r="http://schemas.openxmlformats.org/officeDocument/2006/relationships" xmlns:m="http://schemas.openxmlformats.org/officeDocument/2006/math" xmlns:v="urn:schemas-microsoft-com:vml" xmlns:wp14="http://schemas.microsoft.com/office/word/2010/wordprocessingDrawing" xmlns:wp="http://schemas.openxmlformats.org/drawingml/2006/wordprocessingDrawing" xmlns:w10="urn:schemas-microsoft-com:office:word" xmlns:w="http://schemas.openxmlformats.org/wordprocessingml/2006/main" xmlns:w14="http://schemas.microsoft.com/office/word/2010/wordml" xmlns:w15="http://schemas.microsoft.com/office/word/2012/wordml" xmlns:w16cex="http://schemas.microsoft.com/office/word/2018/wordml/cex" xmlns:w16cid="http://schemas.microsoft.com/office/word/2016/wordml/cid" xmlns:w16="http://schemas.microsoft.com/office/word/2018/wordml" xmlns:w16du="http://schemas.microsoft.com/office/word/2023/wordml/word16du" xmlns:w16sdtdh="http://schemas.microsoft.com/office/word/2020/wordml/sdtdatahash" xmlns:w16se="http://schemas.microsoft.com/office/word/2015/wordml/symex" xmlns:wpg="http://schemas.microsoft.com/office/word/2010/wordprocessingGroup" xmlns:wpi="http://schemas.microsoft.com/office/word/2010/wordprocessingInk" xmlns:wne="http://schemas.microsoft.com/office/word/2006/wordml" xmlns:wps="http://schemas.microsoft.com/office/word/2010/wordprocessingShape" mc:Ignorable="w14 w15 w16se w16cid w16 w16cex w16sdtdh w16du wp14">
+<w:hdr xmlns:wpc="http://schemas.microsoft.com/office/word/2010/wordprocessingCanvas" xmlns:cx="http://schemas.microsoft.com/office/drawing/2014/chartex" xmlns:cx1="http://schemas.microsoft.com/office/drawing/2015/9/8/chartex" xmlns:cx2="http://schemas.microsoft.com/office/drawing/2015/10/21/chartex" xmlns:cx3="http://schemas.microsoft.com/office/drawing/2016/5/9/chartex" xmlns:cx4="http://schemas.microsoft.com/office/drawing/2016/5/10/chartex" xmlns:cx5="http://schemas.microsoft.com/office/drawing/2016/5/11/chartex" xmlns:cx6="http://schemas.microsoft.com/office/drawing/2016/5/12/chartex" xmlns:cx7="http://schemas.microsoft.com/office/drawing/2016/5/13/chartex" xmlns:cx8="http://schemas.microsoft.com/office/drawing/2016/5/14/chartex" xmlns:mc="http://schemas.openxmlformats.org/markup-compatibility/2006" xmlns:m="http://schemas.openxmlformats.org/officeDocument/2006/math" xmlns:aink="http://schemas.microsoft.com/office/drawing/2016/ink" xmlns:am3d="http://schemas.microsoft.com/office/drawing/2017/model3d" xmlns:oel="http://schemas.microsoft.com/office/2019/extlst" xmlns:r="http://schemas.openxmlformats.org/officeDocument/2006/relationships" xmlns:wp14="http://schemas.microsoft.com/office/word/2010/wordprocessingDrawing" xmlns:wp="http://schemas.openxmlformats.org/drawingml/2006/wordprocessingDrawing" xmlns:wpg="http://schemas.microsoft.com/office/word/2010/wordprocessingGroup" xmlns:wpi="http://schemas.microsoft.com/office/word/2010/wordprocessingInk" xmlns:wps="http://schemas.microsoft.com/office/word/2010/wordprocessingShape" xmlns:o="urn:schemas-microsoft-com:office:office" xmlns:v="urn:schemas-microsoft-com:vml" xmlns:w10="urn:schemas-microsoft-com:office:word" xmlns:w="http://schemas.openxmlformats.org/wordprocessingml/2006/main" xmlns:w14="http://schemas.microsoft.com/office/word/2010/wordml" xmlns:w15="http://schemas.microsoft.com/office/word/2012/wordml" xmlns:w16cex="http://schemas.microsoft.com/office/word/2018/wordml/cex" xmlns:w16cid="http://schemas.microsoft.com/office/word/2016/wordml/cid" xmlns:w16="http://schemas.microsoft.com/office/word/2018/wordml" xmlns:w16sdtdh="http://schemas.microsoft.com/office/word/2020/wordml/sdtdatahash" xmlns:w16sdtfl="http://schemas.microsoft.com/office/word/2024/wordml/sdtformatlock" xmlns:w16se="http://schemas.microsoft.com/office/word/2015/wordml/symex" xmlns:w16du="http://schemas.microsoft.com/office/word/2023/wordml/word16du" xmlns:wne="http://schemas.microsoft.com/office/word/2006/wordml" mc:Ignorable="w14 w15 w16se w16cid w16 w16cex w16sdtdh w16sdtfl w16du wp14">
   <w:p>
     <w:pPr>
       <w:pBdr>
@@ -9023,14 +9773,50 @@
         <w:sz w:val="16"/>
         <w:szCs w:val="16"/>
       </w:rPr>
-      <w:t>CE / CS / SE 3354  ·  Fall 2026  ·  Project Deliverable P1 — Proposal and Requirements</w:t>
+      <w:t xml:space="preserve">CE / CS / SE </w:t>
+    </w:r>
+    <w:proofErr w:type="gramStart"/>
+    <w:r>
+      <w:rPr>
+        <w:color w:val="5A6472"/>
+        <w:sz w:val="16"/>
+        <w:szCs w:val="16"/>
+      </w:rPr>
+      <w:t>3354  ·</w:t>
+    </w:r>
+    <w:proofErr w:type="gramEnd"/>
+    <w:r>
+      <w:rPr>
+        <w:color w:val="5A6472"/>
+        <w:sz w:val="16"/>
+        <w:szCs w:val="16"/>
+      </w:rPr>
+      <w:t xml:space="preserve">  Fall </w:t>
+    </w:r>
+    <w:proofErr w:type="gramStart"/>
+    <w:r>
+      <w:rPr>
+        <w:color w:val="5A6472"/>
+        <w:sz w:val="16"/>
+        <w:szCs w:val="16"/>
+      </w:rPr>
+      <w:t>2026  ·</w:t>
+    </w:r>
+    <w:proofErr w:type="gramEnd"/>
+    <w:r>
+      <w:rPr>
+        <w:color w:val="5A6472"/>
+        <w:sz w:val="16"/>
+        <w:szCs w:val="16"/>
+      </w:rPr>
+      <w:t xml:space="preserve">  Project Deliverable P1 — Proposal and Requirements</w:t>
     </w:r>
   </w:p>
 </w:hdr>
 </file>
 
 <file path=word/numbering.xml><?xml version="1.0" encoding="utf-8"?>
-<w:numbering xmlns:wpc="http://schemas.microsoft.com/office/word/2010/wordprocessingCanvas" xmlns:cx="http://schemas.microsoft.com/office/drawing/2014/chartex" xmlns:cx1="http://schemas.microsoft.com/office/drawing/2015/9/8/chartex" xmlns:cx2="http://schemas.microsoft.com/office/drawing/2015/10/21/chartex" xmlns:cx3="http://schemas.microsoft.com/office/drawing/2016/5/9/chartex" xmlns:cx4="http://schemas.microsoft.com/office/drawing/2016/5/10/chartex" xmlns:cx5="http://schemas.microsoft.com/office/drawing/2016/5/11/chartex" xmlns:cx6="http://schemas.microsoft.com/office/drawing/2016/5/12/chartex" xmlns:cx7="http://schemas.microsoft.com/office/drawing/2016/5/13/chartex" xmlns:cx8="http://schemas.microsoft.com/office/drawing/2016/5/14/chartex" xmlns:mc="http://schemas.openxmlformats.org/markup-compatibility/2006" xmlns:aink="http://schemas.microsoft.com/office/drawing/2016/ink" xmlns:am3d="http://schemas.microsoft.com/office/drawing/2017/model3d" xmlns:o="urn:schemas-microsoft-com:office:office" xmlns:oel="http://schemas.microsoft.com/office/2019/extlst" xmlns:r="http://schemas.openxmlformats.org/officeDocument/2006/relationships" xmlns:m="http://schemas.openxmlformats.org/officeDocument/2006/math" xmlns:v="urn:schemas-microsoft-com:vml" xmlns:wp14="http://schemas.microsoft.com/office/word/2010/wordprocessingDrawing" xmlns:wp="http://schemas.openxmlformats.org/drawingml/2006/wordprocessingDrawing" xmlns:w10="urn:schemas-microsoft-com:office:word" xmlns:w="http://schemas.openxmlformats.org/wordprocessingml/2006/main" xmlns:w14="http://schemas.microsoft.com/office/word/2010/wordml" xmlns:w15="http://schemas.microsoft.com/office/word/2012/wordml" xmlns:w16cex="http://schemas.microsoft.com/office/word/2018/wordml/cex" xmlns:w16cid="http://schemas.microsoft.com/office/word/2016/wordml/cid" xmlns:w16="http://schemas.microsoft.com/office/word/2018/wordml" xmlns:w16du="http://schemas.microsoft.com/office/word/2023/wordml/word16du" xmlns:w16sdtdh="http://schemas.microsoft.com/office/word/2020/wordml/sdtdatahash" xmlns:w16se="http://schemas.microsoft.com/office/word/2015/wordml/symex" xmlns:wpg="http://schemas.microsoft.com/office/word/2010/wordprocessingGroup" xmlns:wpi="http://schemas.microsoft.com/office/word/2010/wordprocessingInk" xmlns:wne="http://schemas.microsoft.com/office/word/2006/wordml" xmlns:wps="http://schemas.microsoft.com/office/word/2010/wordprocessingShape" mc:Ignorable="w14 w15 w16se w16cid w16 w16cex w16sdtdh w16du wp14">
+<w:numbering xmlns:wpc="http://schemas.microsoft.com/office/word/2010/wordprocessingCanvas" xmlns:cx="http://schemas.microsoft.com/office/drawing/2014/chartex" xmlns:cx1="http://schemas.microsoft.com/office/drawing/2015/9/8/chartex" xmlns:cx2="http://schemas.microsoft.com/office/drawing/2015/10/21/chartex" xmlns:cx3="http://schemas.microsoft.com/office/drawing/2016/5/9/chartex" xmlns:cx4="http://schemas.microsoft.com/office/drawing/2016/5/10/chartex" xmlns:cx5="http://schemas.microsoft.com/office/drawing/2016/5/11/chartex" xmlns:cx6="http://schemas.microsoft.com/office/drawing/2016/5/12/chartex" xmlns:cx7="http://schemas.microsoft.com/office/drawing/2016/5/13/chartex" xmlns:cx8="http://schemas.microsoft.com/office/drawing/2016/5/14/chartex" xmlns:mc="http://schemas.openxmlformats.org/markup-compatibility/2006" xmlns:m="http://schemas.openxmlformats.org/officeDocument/2006/math" xmlns:aink="http://schemas.microsoft.com/office/drawing/2016/ink" xmlns:am3d="http://schemas.microsoft.com/office/drawing/2017/model3d" xmlns:oel="http://schemas.microsoft.com/office/2019/extlst" xmlns:r="http://schemas.openxmlformats.org/officeDocument/2006/relationships" xmlns:wp14="http://schemas.microsoft.com/office/word/2010/wordprocessingDrawing" xmlns:wp="http://schemas.openxmlformats.org/drawingml/2006/wordprocessingDrawing" xmlns:wpg="http://schemas.microsoft.com/office/word/2010/wordprocessingGroup" xmlns:wpi="http://schemas.microsoft.com/office/word/2010/wordprocessingInk" xmlns:wps="http://schemas.microsoft.com/office/word/2010/wordprocessingShape" xmlns:o="urn:schemas-microsoft-com:office:office" xmlns:v="urn:schemas-microsoft-com:vml" xmlns:w10="urn:schemas-microsoft-com:office:word" xmlns:w="http://schemas.openxmlformats.org/wordprocessingml/2006/main" xmlns:w14="http://schemas.microsoft.com/office/word/2010/wordml" xmlns:w15="http://schemas.microsoft.com/office/word/2012/wordml" xmlns:w16cex="http://schemas.microsoft.com/office/word/2018/wordml/cex" xmlns:w16cid="http://schemas.microsoft.com/office/word/2016/wordml/cid" xmlns:w16="http://schemas.microsoft.com/office/word/2018/wordml" xmlns:w16sdtdh="http://schemas.microsoft.com/office/word/2020/wordml/sdtdatahash" xmlns:w16sdtfl="http://schemas.microsoft.com/office/word/2024/wordml/sdtformatlock" xmlns:w16se="http://schemas.microsoft.com/office/word/2015/wordml/symex" xmlns:w16du="http://schemas.microsoft.com/office/word/2023/wordml/word16du" xmlns:wne="http://schemas.microsoft.com/office/word/2006/wordml" mc:Ignorable="w14 w15 w16se w16cid w16 w16cex w16sdtdh w16sdtfl w16du wp14">
   <w:abstractNum w:abstractNumId="0" w15:restartNumberingAfterBreak="0">
     <w:nsid w:val="0E464751"/>
     <w:multiLevelType w:val="hybridMultilevel"/>
@@ -9127,14 +9913,14 @@
 </file>
 
 <file path=word/styles.xml><?xml version="1.0" encoding="utf-8"?>
-<w:styles xmlns:mc="http://schemas.openxmlformats.org/markup-compatibility/2006" xmlns:r="http://schemas.openxmlformats.org/officeDocument/2006/relationships" xmlns:w="http://schemas.openxmlformats.org/wordprocessingml/2006/main" xmlns:w14="http://schemas.microsoft.com/office/word/2010/wordml" xmlns:w15="http://schemas.microsoft.com/office/word/2012/wordml" xmlns:w16cex="http://schemas.microsoft.com/office/word/2018/wordml/cex" xmlns:w16cid="http://schemas.microsoft.com/office/word/2016/wordml/cid" xmlns:w16="http://schemas.microsoft.com/office/word/2018/wordml" xmlns:w16du="http://schemas.microsoft.com/office/word/2023/wordml/word16du" xmlns:w16sdtdh="http://schemas.microsoft.com/office/word/2020/wordml/sdtdatahash" xmlns:w16se="http://schemas.microsoft.com/office/word/2015/wordml/symex" mc:Ignorable="w14 w15 w16se w16cid w16 w16cex w16sdtdh w16du">
+<w:styles xmlns:mc="http://schemas.openxmlformats.org/markup-compatibility/2006" xmlns:r="http://schemas.openxmlformats.org/officeDocument/2006/relationships" xmlns:w="http://schemas.openxmlformats.org/wordprocessingml/2006/main" xmlns:w14="http://schemas.microsoft.com/office/word/2010/wordml" xmlns:w15="http://schemas.microsoft.com/office/word/2012/wordml" xmlns:w16cex="http://schemas.microsoft.com/office/word/2018/wordml/cex" xmlns:w16cid="http://schemas.microsoft.com/office/word/2016/wordml/cid" xmlns:w16="http://schemas.microsoft.com/office/word/2018/wordml" xmlns:w16sdtdh="http://schemas.microsoft.com/office/word/2020/wordml/sdtdatahash" xmlns:w16sdtfl="http://schemas.microsoft.com/office/word/2024/wordml/sdtformatlock" xmlns:w16se="http://schemas.microsoft.com/office/word/2015/wordml/symex" xmlns:w16du="http://schemas.microsoft.com/office/word/2023/wordml/word16du" mc:Ignorable="w14 w15 w16se w16cid w16 w16cex w16sdtdh w16sdtfl w16du">
   <w:docDefaults>
     <w:rPrDefault>
       <w:rPr>
         <w:rFonts w:ascii="Calibri" w:eastAsia="Calibri" w:hAnsi="Calibri" w:cs="Calibri"/>
         <w:sz w:val="21"/>
         <w:szCs w:val="21"/>
-        <w:lang w:eastAsia="en-US" w:bidi="ar-SA"/>
+        <w:lang w:val="en-US" w:eastAsia="en-US" w:bidi="ar-SA"/>
       </w:rPr>
     </w:rPrDefault>
     <w:pPrDefault/>

</xml_diff>